<commit_message>
fix(build): keep appendix table captions in the built document
The {{A:label}} splice filtered each generated block down to its pipe
rows, which is right for the main-body tables — their captions are
hand-written in paper.md and would otherwise appear twice — but wrong
for the appendix tables, whose only caption is the one the generator
writes. Twenty appendix tables were reaching paper.docx as untitled
grids of numbers, with the tolerances, units and provenance notes in
their captions silently dropped. All twenty now carry their caption.

The word count is unchanged: appendices follow the References heading
and are outside the counted region.

Also records in the pre-submission checklist that build.sh strips the
generative-AI statement and the Acknowledgements, so neither is in
paper.docx and both must be carried into the submitted file by hand.

Co-Authored-By: Claude Opus 5 (1M context) <noreply@anthropic.com>
</commit_message>
<xml_diff>
--- a/00-thesis/paper.docx
+++ b/00-thesis/paper.docx
@@ -19839,6 +19839,14 @@
         <w:t xml:space="preserve">network-mean deficit falling after the start-up transient and then rising monotonically.</w:t>
       </w:r>
     </w:p>
+    <w:p>
+      <w:pPr>
+        <w:pStyle w:val="BodyText"/>
+      </w:pPr>
+      <w:r>
+        <w:t xml:space="preserve">Table A1. Cyclostationarity diagnostics. Worst value across the truth and both corners of the prior box, for each pair of successive 24 h cycles. Tolerances were declared before the values were seen.</w:t>
+      </w:r>
+    </w:p>
     <w:tbl>
       <w:tblPr>
         <w:tblStyle w:val="Table"/>
@@ -20568,7 +20576,14 @@
         </w:tc>
       </w:tr>
     </w:tbl>
-    <w:p/>
+    <w:p>
+      <w:pPr>
+        <w:pStyle w:val="BodyText"/>
+      </w:pPr>
+      <w:r>
+        <w:t xml:space="preserve">Table A2. Network-mean cumulative deficit for the truth, by cycle. The integrated severity falls after the start-up transient and then rises monotonically, which is why the 2% criterion is not met inside the model horizon.</w:t>
+      </w:r>
+    </w:p>
     <w:tbl>
       <w:tblPr>
         <w:tblStyle w:val="Table"/>
@@ -20837,6 +20852,14 @@
       </w:pPr>
       <w:r>
         <w:t xml:space="preserve">Appendix B. Numerical and unit verification</w:t>
+      </w:r>
+    </w:p>
+    <w:p>
+      <w:pPr>
+        <w:pStyle w:val="FirstParagraph"/>
+      </w:pPr>
+      <w:r>
+        <w:t xml:space="preserve">Table B1. Bulk-decay arm of the known-answer test against the analytic first-order solution at the far end of a single pipe. The relative error grows with the amount of decay, which is the signature of the quality solver’s time discretisation; a wrong conversion factor would instead give a constant relative offset.</w:t>
       </w:r>
     </w:p>
     <w:tbl>
@@ -21085,7 +21108,14 @@
         </w:tc>
       </w:tr>
     </w:tbl>
-    <w:p/>
+    <w:p>
+      <w:pPr>
+        <w:pStyle w:val="BodyText"/>
+      </w:pPr>
+      <w:r>
+        <w:t xml:space="preserve">Table B2. Wall-decay arm. The exact concentration cannot be predicted from the wall coefficient alone because EPANET’s first-order wall reaction is also limited by mass transfer, so what is asserted is the sign, monotonicity, and that the result stays above the mass-transfer-free limit.</w:t>
+      </w:r>
+    </w:p>
     <w:tbl>
       <w:tblPr>
         <w:tblStyle w:val="Table"/>
@@ -21446,7 +21476,14 @@
         </w:tc>
       </w:tr>
     </w:tbl>
-    <w:p/>
+    <w:p>
+      <w:pPr>
+        <w:pStyle w:val="BodyText"/>
+      </w:pPr>
+      <w:r>
+        <w:t xml:space="preserve">Table B3. Unit-equivalence test over 256 leading Sobol candidates. The corrected implementation reproduces the superseded one to floating-point precision. The units-only arm shows what correcting the concentrations while leaving the solver tolerance at the EPANET default would have cost.</w:t>
+      </w:r>
+    </w:p>
     <w:tbl>
       <w:tblPr>
         <w:tblStyle w:val="Table"/>
@@ -21799,6 +21836,14 @@
         <w:t xml:space="preserve">Appendix C. Threshold sweep and displaced-prior matrices</w:t>
       </w:r>
     </w:p>
+    <w:p>
+      <w:pPr>
+        <w:pStyle w:val="FirstParagraph"/>
+      </w:pPr>
+      <w:r>
+        <w:t xml:space="preserve">Table C1. Behavioural-threshold sweep for the informal comparator. Tightening the cut-off removes candidates but cannot restore the information factor the score omits, so the retained widths stay far above the formal values.</w:t>
+      </w:r>
+    </w:p>
     <w:tbl>
       <w:tblPr>
         <w:tblStyle w:val="Table"/>
@@ -22135,7 +22180,14 @@
         </w:tc>
       </w:tr>
     </w:tbl>
-    <w:p/>
+    <w:p>
+      <w:pPr>
+        <w:pStyle w:val="BodyText"/>
+      </w:pPr>
+      <w:r>
+        <w:t xml:space="preserve">Table C2. Displaced-prior recovery over 30 noise realisations, as the median fraction of the imposed displacement recovered with its interquartile range, and the retained prior width. DOWN displaces every coefficient towards stronger decay; OLDUP displaces the old coefficient the other way.</w:t>
+      </w:r>
+    </w:p>
     <w:tbl>
       <w:tblPr>
         <w:tblStyle w:val="Table"/>
@@ -23398,6 +23450,14 @@
         <w:t xml:space="preserve">nuisance parameters have been accounted for, not the bound that would apply if they were known.</w:t>
       </w:r>
     </w:p>
+    <w:p>
+      <w:pPr>
+        <w:pStyle w:val="BodyText"/>
+      </w:pPr>
+      <w:r>
+        <w:t xml:space="preserve">Table D1. Cramer-Rao bounds under nested nuisance models, obtained from the marginal (Schur) information. Percentages are the bound as a fraction of the prior standard deviation.</w:t>
+      </w:r>
+    </w:p>
     <w:tbl>
       <w:tblPr>
         <w:tblStyle w:val="Table"/>
@@ -23644,7 +23704,14 @@
         </w:tc>
       </w:tr>
     </w:tbl>
-    <w:p/>
+    <w:p>
+      <w:pPr>
+        <w:pStyle w:val="BodyText"/>
+      </w:pPr>
+      <w:r>
+        <w:t xml:space="preserve">Table D2. Finite-difference step convergence for the Jacobian. Steps are scale-dependent rather than shared, because one absolute step would be a 2% perturbation of the old coefficient and a 40% perturbation of the new one.</w:t>
+      </w:r>
+    </w:p>
     <w:tbl>
       <w:tblPr>
         <w:tblStyle w:val="Table"/>
@@ -24376,7 +24443,14 @@
         </w:tc>
       </w:tr>
     </w:tbl>
-    <w:p/>
+    <w:p>
+      <w:pPr>
+        <w:pStyle w:val="BodyText"/>
+      </w:pPr>
+      <w:r>
+        <w:t xml:space="preserve">Table D3. Eigenvalues of the Case-A information matrix in raw and prior-scaled form. The raw condition number is dominated by the factor of twenty between the coefficient scales; on the dimensionless matrix the spread is far smaller.</w:t>
+      </w:r>
+    </w:p>
     <w:tbl>
       <w:tblPr>
         <w:tblStyle w:val="Table"/>
@@ -24565,492 +24639,12 @@
         </w:tc>
       </w:tr>
     </w:tbl>
-    <w:p/>
-    <w:tbl>
-      <w:tblPr>
-        <w:tblStyle w:val="Table"/>
-        <w:tblW w:type="pct" w:w="5000"/>
-        <w:tblLayout w:type="fixed"/>
-        <w:tblLook w:firstRow="1" w:lastRow="0" w:firstColumn="0" w:lastColumn="0" w:noHBand="0" w:noVBand="0" w:val="0020"/>
-      </w:tblPr>
-      <w:tblGrid>
-        <w:gridCol w:w="1320"/>
-        <w:gridCol w:w="1320"/>
-        <w:gridCol w:w="1320"/>
-        <w:gridCol w:w="1320"/>
-        <w:gridCol w:w="1320"/>
-        <w:gridCol w:w="1320"/>
-      </w:tblGrid>
-      <w:tr>
-        <w:trPr>
-          <w:tblHeader w:val="on"/>
-        </w:trPr>
-        <w:tc>
-          <w:tcPr/>
-          <w:p>
-            <w:pPr>
-              <w:pStyle w:val="Compact"/>
-            </w:pPr>
-            <w:r>
-              <w:t xml:space="preserve">Correlation</w:t>
-            </w:r>
-          </w:p>
-        </w:tc>
-        <w:tc>
-          <w:tcPr/>
-          <w:p>
-            <w:pPr>
-              <w:pStyle w:val="Compact"/>
-            </w:pPr>
-            <w:r>
-              <w:t xml:space="preserve">Effective n</w:t>
-            </w:r>
-          </w:p>
-        </w:tc>
-        <w:tc>
-          <w:tcPr/>
-          <w:p>
-            <w:pPr>
-              <w:pStyle w:val="Compact"/>
-            </w:pPr>
-            <w:r>
-              <w:t xml:space="preserve">old</w:t>
-            </w:r>
-          </w:p>
-        </w:tc>
-        <w:tc>
-          <w:tcPr/>
-          <w:p>
-            <w:pPr>
-              <w:pStyle w:val="Compact"/>
-            </w:pPr>
-            <w:r>
-              <w:t xml:space="preserve">average</w:t>
-            </w:r>
-          </w:p>
-        </w:tc>
-        <w:tc>
-          <w:tcPr/>
-          <w:p>
-            <w:pPr>
-              <w:pStyle w:val="Compact"/>
-            </w:pPr>
-            <w:r>
-              <w:t xml:space="preserve">new</w:t>
-            </w:r>
-          </w:p>
-        </w:tc>
-        <w:tc>
-          <w:tcPr/>
-          <w:p>
-            <w:pPr>
-              <w:pStyle w:val="Compact"/>
-            </w:pPr>
-            <w:r>
-              <w:t xml:space="preserve">Widening (old / avg / new)</w:t>
-            </w:r>
-          </w:p>
-        </w:tc>
-      </w:tr>
-      <w:tr>
-        <w:tc>
-          <w:tcPr/>
-          <w:p>
-            <w:pPr>
-              <w:pStyle w:val="Compact"/>
-            </w:pPr>
-            <w:r>
-              <w:t xml:space="preserve">0.0</w:t>
-            </w:r>
-          </w:p>
-        </w:tc>
-        <w:tc>
-          <w:tcPr/>
-          <w:p>
-            <w:pPr>
-              <w:pStyle w:val="Compact"/>
-            </w:pPr>
-            <w:r>
-              <w:t xml:space="preserve">294</w:t>
-            </w:r>
-          </w:p>
-        </w:tc>
-        <w:tc>
-          <w:tcPr/>
-          <w:p>
-            <w:pPr>
-              <w:pStyle w:val="Compact"/>
-            </w:pPr>
-            <w:r>
-              <w:t xml:space="preserve">0.0947 (25%)</w:t>
-            </w:r>
-          </w:p>
-        </w:tc>
-        <w:tc>
-          <w:tcPr/>
-          <w:p>
-            <w:pPr>
-              <w:pStyle w:val="Compact"/>
-            </w:pPr>
-            <w:r>
-              <w:t xml:space="preserve">0.0135 (29%)</w:t>
-            </w:r>
-          </w:p>
-        </w:tc>
-        <w:tc>
-          <w:tcPr/>
-          <w:p>
-            <w:pPr>
-              <w:pStyle w:val="Compact"/>
-            </w:pPr>
-            <w:r>
-              <w:t xml:space="preserve">0.0080 (29%)</w:t>
-            </w:r>
-          </w:p>
-        </w:tc>
-        <w:tc>
-          <w:tcPr/>
-          <w:p>
-            <w:pPr>
-              <w:pStyle w:val="Compact"/>
-            </w:pPr>
-            <w:r>
-              <w:t xml:space="preserve">1.00 / 1.00 / 1.00</w:t>
-            </w:r>
-          </w:p>
-        </w:tc>
-      </w:tr>
-      <w:tr>
-        <w:tc>
-          <w:tcPr/>
-          <w:p>
-            <w:pPr>
-              <w:pStyle w:val="Compact"/>
-            </w:pPr>
-            <w:r>
-              <w:t xml:space="preserve">0.2</w:t>
-            </w:r>
-          </w:p>
-        </w:tc>
-        <w:tc>
-          <w:tcPr/>
-          <w:p>
-            <w:pPr>
-              <w:pStyle w:val="Compact"/>
-            </w:pPr>
-            <w:r>
-              <w:t xml:space="preserve">196</w:t>
-            </w:r>
-          </w:p>
-        </w:tc>
-        <w:tc>
-          <w:tcPr/>
-          <w:p>
-            <w:pPr>
-              <w:pStyle w:val="Compact"/>
-            </w:pPr>
-            <w:r>
-              <w:t xml:space="preserve">0.1150 (31%)</w:t>
-            </w:r>
-          </w:p>
-        </w:tc>
-        <w:tc>
-          <w:tcPr/>
-          <w:p>
-            <w:pPr>
-              <w:pStyle w:val="Compact"/>
-            </w:pPr>
-            <w:r>
-              <w:t xml:space="preserve">0.0164 (35%)</w:t>
-            </w:r>
-          </w:p>
-        </w:tc>
-        <w:tc>
-          <w:tcPr/>
-          <w:p>
-            <w:pPr>
-              <w:pStyle w:val="Compact"/>
-            </w:pPr>
-            <w:r>
-              <w:t xml:space="preserve">0.0096 (35%)</w:t>
-            </w:r>
-          </w:p>
-        </w:tc>
-        <w:tc>
-          <w:tcPr/>
-          <w:p>
-            <w:pPr>
-              <w:pStyle w:val="Compact"/>
-            </w:pPr>
-            <w:r>
-              <w:t xml:space="preserve">1.21 / 1.21 / 1.20</w:t>
-            </w:r>
-          </w:p>
-        </w:tc>
-      </w:tr>
-      <w:tr>
-        <w:tc>
-          <w:tcPr/>
-          <w:p>
-            <w:pPr>
-              <w:pStyle w:val="Compact"/>
-            </w:pPr>
-            <w:r>
-              <w:t xml:space="preserve">0.4</w:t>
-            </w:r>
-          </w:p>
-        </w:tc>
-        <w:tc>
-          <w:tcPr/>
-          <w:p>
-            <w:pPr>
-              <w:pStyle w:val="Compact"/>
-            </w:pPr>
-            <w:r>
-              <w:t xml:space="preserve">126</w:t>
-            </w:r>
-          </w:p>
-        </w:tc>
-        <w:tc>
-          <w:tcPr/>
-          <w:p>
-            <w:pPr>
-              <w:pStyle w:val="Compact"/>
-            </w:pPr>
-            <w:r>
-              <w:t xml:space="preserve">0.1406 (37%)</w:t>
-            </w:r>
-          </w:p>
-        </w:tc>
-        <w:tc>
-          <w:tcPr/>
-          <w:p>
-            <w:pPr>
-              <w:pStyle w:val="Compact"/>
-            </w:pPr>
-            <w:r>
-              <w:t xml:space="preserve">0.0201 (43%)</w:t>
-            </w:r>
-          </w:p>
-        </w:tc>
-        <w:tc>
-          <w:tcPr/>
-          <w:p>
-            <w:pPr>
-              <w:pStyle w:val="Compact"/>
-            </w:pPr>
-            <w:r>
-              <w:t xml:space="preserve">0.0114 (42%)</w:t>
-            </w:r>
-          </w:p>
-        </w:tc>
-        <w:tc>
-          <w:tcPr/>
-          <w:p>
-            <w:pPr>
-              <w:pStyle w:val="Compact"/>
-            </w:pPr>
-            <w:r>
-              <w:t xml:space="preserve">1.48 / 1.49 / 1.44</w:t>
-            </w:r>
-          </w:p>
-        </w:tc>
-      </w:tr>
-      <w:tr>
-        <w:tc>
-          <w:tcPr/>
-          <w:p>
-            <w:pPr>
-              <w:pStyle w:val="Compact"/>
-            </w:pPr>
-            <w:r>
-              <w:t xml:space="preserve">0.6</w:t>
-            </w:r>
-          </w:p>
-        </w:tc>
-        <w:tc>
-          <w:tcPr/>
-          <w:p>
-            <w:pPr>
-              <w:pStyle w:val="Compact"/>
-            </w:pPr>
-            <w:r>
-              <w:t xml:space="preserve">74</w:t>
-            </w:r>
-          </w:p>
-        </w:tc>
-        <w:tc>
-          <w:tcPr/>
-          <w:p>
-            <w:pPr>
-              <w:pStyle w:val="Compact"/>
-            </w:pPr>
-            <w:r>
-              <w:t xml:space="preserve">0.1736 (46%)</w:t>
-            </w:r>
-          </w:p>
-        </w:tc>
-        <w:tc>
-          <w:tcPr/>
-          <w:p>
-            <w:pPr>
-              <w:pStyle w:val="Compact"/>
-            </w:pPr>
-            <w:r>
-              <w:t xml:space="preserve">0.0252 (55%)</w:t>
-            </w:r>
-          </w:p>
-        </w:tc>
-        <w:tc>
-          <w:tcPr/>
-          <w:p>
-            <w:pPr>
-              <w:pStyle w:val="Compact"/>
-            </w:pPr>
-            <w:r>
-              <w:t xml:space="preserve">0.0135 (49%)</w:t>
-            </w:r>
-          </w:p>
-        </w:tc>
-        <w:tc>
-          <w:tcPr/>
-          <w:p>
-            <w:pPr>
-              <w:pStyle w:val="Compact"/>
-            </w:pPr>
-            <w:r>
-              <w:t xml:space="preserve">1.83 / 1.87 / 1.70</w:t>
-            </w:r>
-          </w:p>
-        </w:tc>
-      </w:tr>
-      <w:tr>
-        <w:tc>
-          <w:tcPr/>
-          <w:p>
-            <w:pPr>
-              <w:pStyle w:val="Compact"/>
-            </w:pPr>
-            <w:r>
-              <w:t xml:space="preserve">0.8</w:t>
-            </w:r>
-          </w:p>
-        </w:tc>
-        <w:tc>
-          <w:tcPr/>
-          <w:p>
-            <w:pPr>
-              <w:pStyle w:val="Compact"/>
-            </w:pPr>
-            <w:r>
-              <w:t xml:space="preserve">33</w:t>
-            </w:r>
-          </w:p>
-        </w:tc>
-        <w:tc>
-          <w:tcPr/>
-          <w:p>
-            <w:pPr>
-              <w:pStyle w:val="Compact"/>
-            </w:pPr>
-            <w:r>
-              <w:t xml:space="preserve">0.2022 (54%)</w:t>
-            </w:r>
-          </w:p>
-        </w:tc>
-        <w:tc>
-          <w:tcPr/>
-          <w:p>
-            <w:pPr>
-              <w:pStyle w:val="Compact"/>
-            </w:pPr>
-            <w:r>
-              <w:t xml:space="preserve">0.0333 (72%)</w:t>
-            </w:r>
-          </w:p>
-        </w:tc>
-        <w:tc>
-          <w:tcPr/>
-          <w:p>
-            <w:pPr>
-              <w:pStyle w:val="Compact"/>
-            </w:pPr>
-            <w:r>
-              <w:t xml:space="preserve">0.0145 (53%)</w:t>
-            </w:r>
-          </w:p>
-        </w:tc>
-        <w:tc>
-          <w:tcPr/>
-          <w:p>
-            <w:pPr>
-              <w:pStyle w:val="Compact"/>
-            </w:pPr>
-            <w:r>
-              <w:t xml:space="preserve">2.13 / 2.47 / 1.82</w:t>
-            </w:r>
-          </w:p>
-        </w:tc>
-      </w:tr>
-    </w:tbl>
-    <w:bookmarkEnd w:id="137"/>
-    <w:bookmarkStart w:id="138" w:name="X1a3ae0efdf8b2c76c22382abba68415e1d80e1c"/>
     <w:p>
       <w:pPr>
-        <w:pStyle w:val="Heading2"/>
+        <w:pStyle w:val="BodyText"/>
       </w:pPr>
       <w:r>
-        <w:t xml:space="preserve">Appendix E. Structural heterogeneity: definitions and per-design results</w:t>
-      </w:r>
-    </w:p>
-    <w:p>
-      <w:pPr>
-        <w:pStyle w:val="FirstParagraph"/>
-      </w:pPr>
-      <w:r>
-        <w:t xml:space="preserve">Four quantities are reported for the heterogeneity experiments and are easy to confuse. The raw</w:t>
-      </w:r>
-      <w:r>
-        <w:t xml:space="preserve"> </w:t>
-      </w:r>
-      <w:r>
-        <w:t xml:space="preserve">bias is the weighted posterior mean minus the true per-zone arithmetic mean. The structural</w:t>
-      </w:r>
-      <w:r>
-        <w:t xml:space="preserve"> </w:t>
-      </w:r>
-      <w:r>
-        <w:t xml:space="preserve">increment subtracts the corresponding homogeneous control run on the same noise, and is the part</w:t>
-      </w:r>
-      <w:r>
-        <w:t xml:space="preserve"> </w:t>
-      </w:r>
-      <w:r>
-        <w:t xml:space="preserve">attributable to the imposed structure rather than to the realisation. The standardised</w:t>
-      </w:r>
-      <w:r>
-        <w:t xml:space="preserve"> </w:t>
-      </w:r>
-      <w:r>
-        <w:t xml:space="preserve">displacement divides by the median within-realisation posterior standard deviation of the</w:t>
-      </w:r>
-      <w:r>
-        <w:t xml:space="preserve"> </w:t>
-      </w:r>
-      <w:r>
-        <w:t xml:space="preserve">unperturbed reference. The displacement fraction is the position of the fit between the two</w:t>
-      </w:r>
-      <w:r>
-        <w:t xml:space="preserve"> </w:t>
-      </w:r>
-      <w:r>
-        <w:t xml:space="preserve">candidate targets, the arithmetic mean and the length-weighted value, and is undefined where they</w:t>
-      </w:r>
-      <w:r>
-        <w:t xml:space="preserve"> </w:t>
-      </w:r>
-      <w:r>
-        <w:t xml:space="preserve">coincide.</w:t>
+        <w:t xml:space="preserve">Table D4. Case-A bounds under an assumed AR(1) residual covariance, swept over the correlation parameter. The correlation is assumed rather than estimated, since the baseline observations are generated independently; the sweep therefore bounds how much the reported precision would degrade if the residuals were in fact correlated. Widening is the bound relative to the independent case, given for old, average and new. The three coefficients widen almost together up to a correlation of 0.4 and separate beyond it, the new coefficient least and the average coefficient most.</w:t>
       </w:r>
     </w:p>
     <w:tbl>
@@ -25079,62 +24673,62 @@
               <w:pStyle w:val="Compact"/>
             </w:pPr>
             <w:r>
-              <w:t xml:space="preserve">Jitter</w:t>
-            </w:r>
-          </w:p>
-        </w:tc>
-        <w:tc>
-          <w:tcPr/>
-          <w:p>
-            <w:pPr>
-              <w:pStyle w:val="Compact"/>
-            </w:pPr>
-            <w:r>
-              <w:t xml:space="preserve">Zone</w:t>
-            </w:r>
-          </w:p>
-        </w:tc>
-        <w:tc>
-          <w:tcPr/>
-          <w:p>
-            <w:pPr>
-              <w:pStyle w:val="Compact"/>
-            </w:pPr>
-            <w:r>
-              <w:t xml:space="preserve">True arithmetic mean</w:t>
-            </w:r>
-          </w:p>
-        </w:tc>
-        <w:tc>
-          <w:tcPr/>
-          <w:p>
-            <w:pPr>
-              <w:pStyle w:val="Compact"/>
-            </w:pPr>
-            <w:r>
-              <w:t xml:space="preserve">Raw bias</w:t>
-            </w:r>
-          </w:p>
-        </w:tc>
-        <w:tc>
-          <w:tcPr/>
-          <w:p>
-            <w:pPr>
-              <w:pStyle w:val="Compact"/>
-            </w:pPr>
-            <w:r>
-              <w:t xml:space="preserve">In posterior SD</w:t>
-            </w:r>
-          </w:p>
-        </w:tc>
-        <w:tc>
-          <w:tcPr/>
-          <w:p>
-            <w:pPr>
-              <w:pStyle w:val="Compact"/>
-            </w:pPr>
-            <w:r>
-              <w:t xml:space="preserve">Increment over control</w:t>
+              <w:t xml:space="preserve">Correlation</w:t>
+            </w:r>
+          </w:p>
+        </w:tc>
+        <w:tc>
+          <w:tcPr/>
+          <w:p>
+            <w:pPr>
+              <w:pStyle w:val="Compact"/>
+            </w:pPr>
+            <w:r>
+              <w:t xml:space="preserve">Effective n</w:t>
+            </w:r>
+          </w:p>
+        </w:tc>
+        <w:tc>
+          <w:tcPr/>
+          <w:p>
+            <w:pPr>
+              <w:pStyle w:val="Compact"/>
+            </w:pPr>
+            <w:r>
+              <w:t xml:space="preserve">old</w:t>
+            </w:r>
+          </w:p>
+        </w:tc>
+        <w:tc>
+          <w:tcPr/>
+          <w:p>
+            <w:pPr>
+              <w:pStyle w:val="Compact"/>
+            </w:pPr>
+            <w:r>
+              <w:t xml:space="preserve">average</w:t>
+            </w:r>
+          </w:p>
+        </w:tc>
+        <w:tc>
+          <w:tcPr/>
+          <w:p>
+            <w:pPr>
+              <w:pStyle w:val="Compact"/>
+            </w:pPr>
+            <w:r>
+              <w:t xml:space="preserve">new</w:t>
+            </w:r>
+          </w:p>
+        </w:tc>
+        <w:tc>
+          <w:tcPr/>
+          <w:p>
+            <w:pPr>
+              <w:pStyle w:val="Compact"/>
+            </w:pPr>
+            <w:r>
+              <w:t xml:space="preserve">Widening (old / avg / new)</w:t>
             </w:r>
           </w:p>
         </w:tc>
@@ -25147,62 +24741,62 @@
               <w:pStyle w:val="Compact"/>
             </w:pPr>
             <w:r>
-              <w:t xml:space="preserve">0%</w:t>
-            </w:r>
-          </w:p>
-        </w:tc>
-        <w:tc>
-          <w:tcPr/>
-          <w:p>
-            <w:pPr>
-              <w:pStyle w:val="Compact"/>
-            </w:pPr>
-            <w:r>
-              <w:t xml:space="preserve">old</w:t>
-            </w:r>
-          </w:p>
-        </w:tc>
-        <w:tc>
-          <w:tcPr/>
-          <w:p>
-            <w:pPr>
-              <w:pStyle w:val="Compact"/>
-            </w:pPr>
-            <w:r>
-              <w:t xml:space="preserve">-1.0000</w:t>
-            </w:r>
-          </w:p>
-        </w:tc>
-        <w:tc>
-          <w:tcPr/>
-          <w:p>
-            <w:pPr>
-              <w:pStyle w:val="Compact"/>
-            </w:pPr>
-            <w:r>
-              <w:t xml:space="preserve">+0.0124</w:t>
-            </w:r>
-          </w:p>
-        </w:tc>
-        <w:tc>
-          <w:tcPr/>
-          <w:p>
-            <w:pPr>
-              <w:pStyle w:val="Compact"/>
-            </w:pPr>
-            <w:r>
-              <w:t xml:space="preserve">+0.13</w:t>
-            </w:r>
-          </w:p>
-        </w:tc>
-        <w:tc>
-          <w:tcPr/>
-          <w:p>
-            <w:pPr>
-              <w:pStyle w:val="Compact"/>
-            </w:pPr>
-            <w:r>
-              <w:t xml:space="preserve">+0.0000</w:t>
+              <w:t xml:space="preserve">0.0</w:t>
+            </w:r>
+          </w:p>
+        </w:tc>
+        <w:tc>
+          <w:tcPr/>
+          <w:p>
+            <w:pPr>
+              <w:pStyle w:val="Compact"/>
+            </w:pPr>
+            <w:r>
+              <w:t xml:space="preserve">294</w:t>
+            </w:r>
+          </w:p>
+        </w:tc>
+        <w:tc>
+          <w:tcPr/>
+          <w:p>
+            <w:pPr>
+              <w:pStyle w:val="Compact"/>
+            </w:pPr>
+            <w:r>
+              <w:t xml:space="preserve">0.0947 (25%)</w:t>
+            </w:r>
+          </w:p>
+        </w:tc>
+        <w:tc>
+          <w:tcPr/>
+          <w:p>
+            <w:pPr>
+              <w:pStyle w:val="Compact"/>
+            </w:pPr>
+            <w:r>
+              <w:t xml:space="preserve">0.0135 (29%)</w:t>
+            </w:r>
+          </w:p>
+        </w:tc>
+        <w:tc>
+          <w:tcPr/>
+          <w:p>
+            <w:pPr>
+              <w:pStyle w:val="Compact"/>
+            </w:pPr>
+            <w:r>
+              <w:t xml:space="preserve">0.0080 (29%)</w:t>
+            </w:r>
+          </w:p>
+        </w:tc>
+        <w:tc>
+          <w:tcPr/>
+          <w:p>
+            <w:pPr>
+              <w:pStyle w:val="Compact"/>
+            </w:pPr>
+            <w:r>
+              <w:t xml:space="preserve">1.00 / 1.00 / 1.00</w:t>
             </w:r>
           </w:p>
         </w:tc>
@@ -25215,62 +24809,62 @@
               <w:pStyle w:val="Compact"/>
             </w:pPr>
             <w:r>
-              <w:t xml:space="preserve">0%</w:t>
-            </w:r>
-          </w:p>
-        </w:tc>
-        <w:tc>
-          <w:tcPr/>
-          <w:p>
-            <w:pPr>
-              <w:pStyle w:val="Compact"/>
-            </w:pPr>
-            <w:r>
-              <w:t xml:space="preserve">average</w:t>
-            </w:r>
-          </w:p>
-        </w:tc>
-        <w:tc>
-          <w:tcPr/>
-          <w:p>
-            <w:pPr>
-              <w:pStyle w:val="Compact"/>
-            </w:pPr>
-            <w:r>
-              <w:t xml:space="preserve">-0.1000</w:t>
-            </w:r>
-          </w:p>
-        </w:tc>
-        <w:tc>
-          <w:tcPr/>
-          <w:p>
-            <w:pPr>
-              <w:pStyle w:val="Compact"/>
-            </w:pPr>
-            <w:r>
-              <w:t xml:space="preserve">-0.0091</w:t>
-            </w:r>
-          </w:p>
-        </w:tc>
-        <w:tc>
-          <w:tcPr/>
-          <w:p>
-            <w:pPr>
-              <w:pStyle w:val="Compact"/>
-            </w:pPr>
-            <w:r>
-              <w:t xml:space="preserve">-0.64</w:t>
-            </w:r>
-          </w:p>
-        </w:tc>
-        <w:tc>
-          <w:tcPr/>
-          <w:p>
-            <w:pPr>
-              <w:pStyle w:val="Compact"/>
-            </w:pPr>
-            <w:r>
-              <w:t xml:space="preserve">+0.0000</w:t>
+              <w:t xml:space="preserve">0.2</w:t>
+            </w:r>
+          </w:p>
+        </w:tc>
+        <w:tc>
+          <w:tcPr/>
+          <w:p>
+            <w:pPr>
+              <w:pStyle w:val="Compact"/>
+            </w:pPr>
+            <w:r>
+              <w:t xml:space="preserve">196</w:t>
+            </w:r>
+          </w:p>
+        </w:tc>
+        <w:tc>
+          <w:tcPr/>
+          <w:p>
+            <w:pPr>
+              <w:pStyle w:val="Compact"/>
+            </w:pPr>
+            <w:r>
+              <w:t xml:space="preserve">0.1150 (31%)</w:t>
+            </w:r>
+          </w:p>
+        </w:tc>
+        <w:tc>
+          <w:tcPr/>
+          <w:p>
+            <w:pPr>
+              <w:pStyle w:val="Compact"/>
+            </w:pPr>
+            <w:r>
+              <w:t xml:space="preserve">0.0164 (35%)</w:t>
+            </w:r>
+          </w:p>
+        </w:tc>
+        <w:tc>
+          <w:tcPr/>
+          <w:p>
+            <w:pPr>
+              <w:pStyle w:val="Compact"/>
+            </w:pPr>
+            <w:r>
+              <w:t xml:space="preserve">0.0096 (35%)</w:t>
+            </w:r>
+          </w:p>
+        </w:tc>
+        <w:tc>
+          <w:tcPr/>
+          <w:p>
+            <w:pPr>
+              <w:pStyle w:val="Compact"/>
+            </w:pPr>
+            <w:r>
+              <w:t xml:space="preserve">1.21 / 1.21 / 1.20</w:t>
             </w:r>
           </w:p>
         </w:tc>
@@ -25283,62 +24877,62 @@
               <w:pStyle w:val="Compact"/>
             </w:pPr>
             <w:r>
-              <w:t xml:space="preserve">0%</w:t>
-            </w:r>
-          </w:p>
-        </w:tc>
-        <w:tc>
-          <w:tcPr/>
-          <w:p>
-            <w:pPr>
-              <w:pStyle w:val="Compact"/>
-            </w:pPr>
-            <w:r>
-              <w:t xml:space="preserve">new</w:t>
-            </w:r>
-          </w:p>
-        </w:tc>
-        <w:tc>
-          <w:tcPr/>
-          <w:p>
-            <w:pPr>
-              <w:pStyle w:val="Compact"/>
-            </w:pPr>
-            <w:r>
-              <w:t xml:space="preserve">-0.0500</w:t>
-            </w:r>
-          </w:p>
-        </w:tc>
-        <w:tc>
-          <w:tcPr/>
-          <w:p>
-            <w:pPr>
-              <w:pStyle w:val="Compact"/>
-            </w:pPr>
-            <w:r>
-              <w:t xml:space="preserve">+0.0060</w:t>
-            </w:r>
-          </w:p>
-        </w:tc>
-        <w:tc>
-          <w:tcPr/>
-          <w:p>
-            <w:pPr>
-              <w:pStyle w:val="Compact"/>
-            </w:pPr>
-            <w:r>
-              <w:t xml:space="preserve">+0.77</w:t>
-            </w:r>
-          </w:p>
-        </w:tc>
-        <w:tc>
-          <w:tcPr/>
-          <w:p>
-            <w:pPr>
-              <w:pStyle w:val="Compact"/>
-            </w:pPr>
-            <w:r>
-              <w:t xml:space="preserve">+0.0000</w:t>
+              <w:t xml:space="preserve">0.4</w:t>
+            </w:r>
+          </w:p>
+        </w:tc>
+        <w:tc>
+          <w:tcPr/>
+          <w:p>
+            <w:pPr>
+              <w:pStyle w:val="Compact"/>
+            </w:pPr>
+            <w:r>
+              <w:t xml:space="preserve">126</w:t>
+            </w:r>
+          </w:p>
+        </w:tc>
+        <w:tc>
+          <w:tcPr/>
+          <w:p>
+            <w:pPr>
+              <w:pStyle w:val="Compact"/>
+            </w:pPr>
+            <w:r>
+              <w:t xml:space="preserve">0.1406 (37%)</w:t>
+            </w:r>
+          </w:p>
+        </w:tc>
+        <w:tc>
+          <w:tcPr/>
+          <w:p>
+            <w:pPr>
+              <w:pStyle w:val="Compact"/>
+            </w:pPr>
+            <w:r>
+              <w:t xml:space="preserve">0.0201 (43%)</w:t>
+            </w:r>
+          </w:p>
+        </w:tc>
+        <w:tc>
+          <w:tcPr/>
+          <w:p>
+            <w:pPr>
+              <w:pStyle w:val="Compact"/>
+            </w:pPr>
+            <w:r>
+              <w:t xml:space="preserve">0.0114 (42%)</w:t>
+            </w:r>
+          </w:p>
+        </w:tc>
+        <w:tc>
+          <w:tcPr/>
+          <w:p>
+            <w:pPr>
+              <w:pStyle w:val="Compact"/>
+            </w:pPr>
+            <w:r>
+              <w:t xml:space="preserve">1.48 / 1.49 / 1.44</w:t>
             </w:r>
           </w:p>
         </w:tc>
@@ -25351,62 +24945,62 @@
               <w:pStyle w:val="Compact"/>
             </w:pPr>
             <w:r>
-              <w:t xml:space="preserve">20%</w:t>
-            </w:r>
-          </w:p>
-        </w:tc>
-        <w:tc>
-          <w:tcPr/>
-          <w:p>
-            <w:pPr>
-              <w:pStyle w:val="Compact"/>
-            </w:pPr>
-            <w:r>
-              <w:t xml:space="preserve">old</w:t>
-            </w:r>
-          </w:p>
-        </w:tc>
-        <w:tc>
-          <w:tcPr/>
-          <w:p>
-            <w:pPr>
-              <w:pStyle w:val="Compact"/>
-            </w:pPr>
-            <w:r>
-              <w:t xml:space="preserve">-1.0066</w:t>
-            </w:r>
-          </w:p>
-        </w:tc>
-        <w:tc>
-          <w:tcPr/>
-          <w:p>
-            <w:pPr>
-              <w:pStyle w:val="Compact"/>
-            </w:pPr>
-            <w:r>
-              <w:t xml:space="preserve">-0.0200</w:t>
-            </w:r>
-          </w:p>
-        </w:tc>
-        <w:tc>
-          <w:tcPr/>
-          <w:p>
-            <w:pPr>
-              <w:pStyle w:val="Compact"/>
-            </w:pPr>
-            <w:r>
-              <w:t xml:space="preserve">-0.20</w:t>
-            </w:r>
-          </w:p>
-        </w:tc>
-        <w:tc>
-          <w:tcPr/>
-          <w:p>
-            <w:pPr>
-              <w:pStyle w:val="Compact"/>
-            </w:pPr>
-            <w:r>
-              <w:t xml:space="preserve">-0.0325</w:t>
+              <w:t xml:space="preserve">0.6</w:t>
+            </w:r>
+          </w:p>
+        </w:tc>
+        <w:tc>
+          <w:tcPr/>
+          <w:p>
+            <w:pPr>
+              <w:pStyle w:val="Compact"/>
+            </w:pPr>
+            <w:r>
+              <w:t xml:space="preserve">74</w:t>
+            </w:r>
+          </w:p>
+        </w:tc>
+        <w:tc>
+          <w:tcPr/>
+          <w:p>
+            <w:pPr>
+              <w:pStyle w:val="Compact"/>
+            </w:pPr>
+            <w:r>
+              <w:t xml:space="preserve">0.1736 (46%)</w:t>
+            </w:r>
+          </w:p>
+        </w:tc>
+        <w:tc>
+          <w:tcPr/>
+          <w:p>
+            <w:pPr>
+              <w:pStyle w:val="Compact"/>
+            </w:pPr>
+            <w:r>
+              <w:t xml:space="preserve">0.0252 (55%)</w:t>
+            </w:r>
+          </w:p>
+        </w:tc>
+        <w:tc>
+          <w:tcPr/>
+          <w:p>
+            <w:pPr>
+              <w:pStyle w:val="Compact"/>
+            </w:pPr>
+            <w:r>
+              <w:t xml:space="preserve">0.0135 (49%)</w:t>
+            </w:r>
+          </w:p>
+        </w:tc>
+        <w:tc>
+          <w:tcPr/>
+          <w:p>
+            <w:pPr>
+              <w:pStyle w:val="Compact"/>
+            </w:pPr>
+            <w:r>
+              <w:t xml:space="preserve">1.83 / 1.87 / 1.70</w:t>
             </w:r>
           </w:p>
         </w:tc>
@@ -25419,62 +25013,217 @@
               <w:pStyle w:val="Compact"/>
             </w:pPr>
             <w:r>
-              <w:t xml:space="preserve">20%</w:t>
-            </w:r>
-          </w:p>
-        </w:tc>
-        <w:tc>
-          <w:tcPr/>
-          <w:p>
-            <w:pPr>
-              <w:pStyle w:val="Compact"/>
-            </w:pPr>
-            <w:r>
-              <w:t xml:space="preserve">average</w:t>
-            </w:r>
-          </w:p>
-        </w:tc>
-        <w:tc>
-          <w:tcPr/>
-          <w:p>
-            <w:pPr>
-              <w:pStyle w:val="Compact"/>
-            </w:pPr>
-            <w:r>
-              <w:t xml:space="preserve">-0.0978</w:t>
-            </w:r>
-          </w:p>
-        </w:tc>
-        <w:tc>
-          <w:tcPr/>
-          <w:p>
-            <w:pPr>
-              <w:pStyle w:val="Compact"/>
-            </w:pPr>
-            <w:r>
-              <w:t xml:space="preserve">-0.0104</w:t>
-            </w:r>
-          </w:p>
-        </w:tc>
-        <w:tc>
-          <w:tcPr/>
-          <w:p>
-            <w:pPr>
-              <w:pStyle w:val="Compact"/>
-            </w:pPr>
-            <w:r>
-              <w:t xml:space="preserve">-0.74</w:t>
-            </w:r>
-          </w:p>
-        </w:tc>
-        <w:tc>
-          <w:tcPr/>
-          <w:p>
-            <w:pPr>
-              <w:pStyle w:val="Compact"/>
-            </w:pPr>
-            <w:r>
-              <w:t xml:space="preserve">-0.0012</w:t>
+              <w:t xml:space="preserve">0.8</w:t>
+            </w:r>
+          </w:p>
+        </w:tc>
+        <w:tc>
+          <w:tcPr/>
+          <w:p>
+            <w:pPr>
+              <w:pStyle w:val="Compact"/>
+            </w:pPr>
+            <w:r>
+              <w:t xml:space="preserve">33</w:t>
+            </w:r>
+          </w:p>
+        </w:tc>
+        <w:tc>
+          <w:tcPr/>
+          <w:p>
+            <w:pPr>
+              <w:pStyle w:val="Compact"/>
+            </w:pPr>
+            <w:r>
+              <w:t xml:space="preserve">0.2022 (54%)</w:t>
+            </w:r>
+          </w:p>
+        </w:tc>
+        <w:tc>
+          <w:tcPr/>
+          <w:p>
+            <w:pPr>
+              <w:pStyle w:val="Compact"/>
+            </w:pPr>
+            <w:r>
+              <w:t xml:space="preserve">0.0333 (72%)</w:t>
+            </w:r>
+          </w:p>
+        </w:tc>
+        <w:tc>
+          <w:tcPr/>
+          <w:p>
+            <w:pPr>
+              <w:pStyle w:val="Compact"/>
+            </w:pPr>
+            <w:r>
+              <w:t xml:space="preserve">0.0145 (53%)</w:t>
+            </w:r>
+          </w:p>
+        </w:tc>
+        <w:tc>
+          <w:tcPr/>
+          <w:p>
+            <w:pPr>
+              <w:pStyle w:val="Compact"/>
+            </w:pPr>
+            <w:r>
+              <w:t xml:space="preserve">2.13 / 2.47 / 1.82</w:t>
+            </w:r>
+          </w:p>
+        </w:tc>
+      </w:tr>
+    </w:tbl>
+    <w:bookmarkEnd w:id="137"/>
+    <w:bookmarkStart w:id="138" w:name="X1a3ae0efdf8b2c76c22382abba68415e1d80e1c"/>
+    <w:p>
+      <w:pPr>
+        <w:pStyle w:val="Heading2"/>
+      </w:pPr>
+      <w:r>
+        <w:t xml:space="preserve">Appendix E. Structural heterogeneity: definitions and per-design results</w:t>
+      </w:r>
+    </w:p>
+    <w:p>
+      <w:pPr>
+        <w:pStyle w:val="FirstParagraph"/>
+      </w:pPr>
+      <w:r>
+        <w:t xml:space="preserve">Four quantities are reported for the heterogeneity experiments and are easy to confuse. The raw</w:t>
+      </w:r>
+      <w:r>
+        <w:t xml:space="preserve"> </w:t>
+      </w:r>
+      <w:r>
+        <w:t xml:space="preserve">bias is the weighted posterior mean minus the true per-zone arithmetic mean. The structural</w:t>
+      </w:r>
+      <w:r>
+        <w:t xml:space="preserve"> </w:t>
+      </w:r>
+      <w:r>
+        <w:t xml:space="preserve">increment subtracts the corresponding homogeneous control run on the same noise, and is the part</w:t>
+      </w:r>
+      <w:r>
+        <w:t xml:space="preserve"> </w:t>
+      </w:r>
+      <w:r>
+        <w:t xml:space="preserve">attributable to the imposed structure rather than to the realisation. The standardised</w:t>
+      </w:r>
+      <w:r>
+        <w:t xml:space="preserve"> </w:t>
+      </w:r>
+      <w:r>
+        <w:t xml:space="preserve">displacement divides by the median within-realisation posterior standard deviation of the</w:t>
+      </w:r>
+      <w:r>
+        <w:t xml:space="preserve"> </w:t>
+      </w:r>
+      <w:r>
+        <w:t xml:space="preserve">unperturbed reference. The displacement fraction is the position of the fit between the two</w:t>
+      </w:r>
+      <w:r>
+        <w:t xml:space="preserve"> </w:t>
+      </w:r>
+      <w:r>
+        <w:t xml:space="preserve">candidate targets, the arithmetic mean and the length-weighted value, and is undefined where they</w:t>
+      </w:r>
+      <w:r>
+        <w:t xml:space="preserve"> </w:t>
+      </w:r>
+      <w:r>
+        <w:t xml:space="preserve">coincide.</w:t>
+      </w:r>
+    </w:p>
+    <w:p>
+      <w:pPr>
+        <w:pStyle w:val="BodyText"/>
+      </w:pPr>
+      <w:r>
+        <w:t xml:space="preserve">Table E1. Symmetric within-zone heterogeneity under the primary rule. The increment is the bias net of a paired homogeneous control run on the same noise, which is the part that can be attributed to the imposed structure.</w:t>
+      </w:r>
+    </w:p>
+    <w:tbl>
+      <w:tblPr>
+        <w:tblStyle w:val="Table"/>
+        <w:tblW w:type="pct" w:w="5000"/>
+        <w:tblLayout w:type="fixed"/>
+        <w:tblLook w:firstRow="1" w:lastRow="0" w:firstColumn="0" w:lastColumn="0" w:noHBand="0" w:noVBand="0" w:val="0020"/>
+      </w:tblPr>
+      <w:tblGrid>
+        <w:gridCol w:w="1320"/>
+        <w:gridCol w:w="1320"/>
+        <w:gridCol w:w="1320"/>
+        <w:gridCol w:w="1320"/>
+        <w:gridCol w:w="1320"/>
+        <w:gridCol w:w="1320"/>
+      </w:tblGrid>
+      <w:tr>
+        <w:trPr>
+          <w:tblHeader w:val="on"/>
+        </w:trPr>
+        <w:tc>
+          <w:tcPr/>
+          <w:p>
+            <w:pPr>
+              <w:pStyle w:val="Compact"/>
+            </w:pPr>
+            <w:r>
+              <w:t xml:space="preserve">Jitter</w:t>
+            </w:r>
+          </w:p>
+        </w:tc>
+        <w:tc>
+          <w:tcPr/>
+          <w:p>
+            <w:pPr>
+              <w:pStyle w:val="Compact"/>
+            </w:pPr>
+            <w:r>
+              <w:t xml:space="preserve">Zone</w:t>
+            </w:r>
+          </w:p>
+        </w:tc>
+        <w:tc>
+          <w:tcPr/>
+          <w:p>
+            <w:pPr>
+              <w:pStyle w:val="Compact"/>
+            </w:pPr>
+            <w:r>
+              <w:t xml:space="preserve">True arithmetic mean</w:t>
+            </w:r>
+          </w:p>
+        </w:tc>
+        <w:tc>
+          <w:tcPr/>
+          <w:p>
+            <w:pPr>
+              <w:pStyle w:val="Compact"/>
+            </w:pPr>
+            <w:r>
+              <w:t xml:space="preserve">Raw bias</w:t>
+            </w:r>
+          </w:p>
+        </w:tc>
+        <w:tc>
+          <w:tcPr/>
+          <w:p>
+            <w:pPr>
+              <w:pStyle w:val="Compact"/>
+            </w:pPr>
+            <w:r>
+              <w:t xml:space="preserve">In posterior SD</w:t>
+            </w:r>
+          </w:p>
+        </w:tc>
+        <w:tc>
+          <w:tcPr/>
+          <w:p>
+            <w:pPr>
+              <w:pStyle w:val="Compact"/>
+            </w:pPr>
+            <w:r>
+              <w:t xml:space="preserve">Increment over control</w:t>
             </w:r>
           </w:p>
         </w:tc>
@@ -25487,62 +25236,62 @@
               <w:pStyle w:val="Compact"/>
             </w:pPr>
             <w:r>
-              <w:t xml:space="preserve">20%</w:t>
-            </w:r>
-          </w:p>
-        </w:tc>
-        <w:tc>
-          <w:tcPr/>
-          <w:p>
-            <w:pPr>
-              <w:pStyle w:val="Compact"/>
-            </w:pPr>
-            <w:r>
-              <w:t xml:space="preserve">new</w:t>
-            </w:r>
-          </w:p>
-        </w:tc>
-        <w:tc>
-          <w:tcPr/>
-          <w:p>
-            <w:pPr>
-              <w:pStyle w:val="Compact"/>
-            </w:pPr>
-            <w:r>
-              <w:t xml:space="preserve">-0.0487</w:t>
-            </w:r>
-          </w:p>
-        </w:tc>
-        <w:tc>
-          <w:tcPr/>
-          <w:p>
-            <w:pPr>
-              <w:pStyle w:val="Compact"/>
-            </w:pPr>
-            <w:r>
-              <w:t xml:space="preserve">+0.0071</w:t>
-            </w:r>
-          </w:p>
-        </w:tc>
-        <w:tc>
-          <w:tcPr/>
-          <w:p>
-            <w:pPr>
-              <w:pStyle w:val="Compact"/>
-            </w:pPr>
-            <w:r>
-              <w:t xml:space="preserve">+0.93</w:t>
-            </w:r>
-          </w:p>
-        </w:tc>
-        <w:tc>
-          <w:tcPr/>
-          <w:p>
-            <w:pPr>
-              <w:pStyle w:val="Compact"/>
-            </w:pPr>
-            <w:r>
-              <w:t xml:space="preserve">+0.0011</w:t>
+              <w:t xml:space="preserve">0%</w:t>
+            </w:r>
+          </w:p>
+        </w:tc>
+        <w:tc>
+          <w:tcPr/>
+          <w:p>
+            <w:pPr>
+              <w:pStyle w:val="Compact"/>
+            </w:pPr>
+            <w:r>
+              <w:t xml:space="preserve">old</w:t>
+            </w:r>
+          </w:p>
+        </w:tc>
+        <w:tc>
+          <w:tcPr/>
+          <w:p>
+            <w:pPr>
+              <w:pStyle w:val="Compact"/>
+            </w:pPr>
+            <w:r>
+              <w:t xml:space="preserve">-1.0000</w:t>
+            </w:r>
+          </w:p>
+        </w:tc>
+        <w:tc>
+          <w:tcPr/>
+          <w:p>
+            <w:pPr>
+              <w:pStyle w:val="Compact"/>
+            </w:pPr>
+            <w:r>
+              <w:t xml:space="preserve">+0.0124</w:t>
+            </w:r>
+          </w:p>
+        </w:tc>
+        <w:tc>
+          <w:tcPr/>
+          <w:p>
+            <w:pPr>
+              <w:pStyle w:val="Compact"/>
+            </w:pPr>
+            <w:r>
+              <w:t xml:space="preserve">+0.13</w:t>
+            </w:r>
+          </w:p>
+        </w:tc>
+        <w:tc>
+          <w:tcPr/>
+          <w:p>
+            <w:pPr>
+              <w:pStyle w:val="Compact"/>
+            </w:pPr>
+            <w:r>
+              <w:t xml:space="preserve">+0.0000</w:t>
             </w:r>
           </w:p>
         </w:tc>
@@ -25555,62 +25304,62 @@
               <w:pStyle w:val="Compact"/>
             </w:pPr>
             <w:r>
-              <w:t xml:space="preserve">35%</w:t>
-            </w:r>
-          </w:p>
-        </w:tc>
-        <w:tc>
-          <w:tcPr/>
-          <w:p>
-            <w:pPr>
-              <w:pStyle w:val="Compact"/>
-            </w:pPr>
-            <w:r>
-              <w:t xml:space="preserve">old</w:t>
-            </w:r>
-          </w:p>
-        </w:tc>
-        <w:tc>
-          <w:tcPr/>
-          <w:p>
-            <w:pPr>
-              <w:pStyle w:val="Compact"/>
-            </w:pPr>
-            <w:r>
-              <w:t xml:space="preserve">-1.0115</w:t>
-            </w:r>
-          </w:p>
-        </w:tc>
-        <w:tc>
-          <w:tcPr/>
-          <w:p>
-            <w:pPr>
-              <w:pStyle w:val="Compact"/>
-            </w:pPr>
-            <w:r>
-              <w:t xml:space="preserve">-0.0334</w:t>
-            </w:r>
-          </w:p>
-        </w:tc>
-        <w:tc>
-          <w:tcPr/>
-          <w:p>
-            <w:pPr>
-              <w:pStyle w:val="Compact"/>
-            </w:pPr>
-            <w:r>
-              <w:t xml:space="preserve">-0.33</w:t>
-            </w:r>
-          </w:p>
-        </w:tc>
-        <w:tc>
-          <w:tcPr/>
-          <w:p>
-            <w:pPr>
-              <w:pStyle w:val="Compact"/>
-            </w:pPr>
-            <w:r>
-              <w:t xml:space="preserve">-0.0458</w:t>
+              <w:t xml:space="preserve">0%</w:t>
+            </w:r>
+          </w:p>
+        </w:tc>
+        <w:tc>
+          <w:tcPr/>
+          <w:p>
+            <w:pPr>
+              <w:pStyle w:val="Compact"/>
+            </w:pPr>
+            <w:r>
+              <w:t xml:space="preserve">average</w:t>
+            </w:r>
+          </w:p>
+        </w:tc>
+        <w:tc>
+          <w:tcPr/>
+          <w:p>
+            <w:pPr>
+              <w:pStyle w:val="Compact"/>
+            </w:pPr>
+            <w:r>
+              <w:t xml:space="preserve">-0.1000</w:t>
+            </w:r>
+          </w:p>
+        </w:tc>
+        <w:tc>
+          <w:tcPr/>
+          <w:p>
+            <w:pPr>
+              <w:pStyle w:val="Compact"/>
+            </w:pPr>
+            <w:r>
+              <w:t xml:space="preserve">-0.0091</w:t>
+            </w:r>
+          </w:p>
+        </w:tc>
+        <w:tc>
+          <w:tcPr/>
+          <w:p>
+            <w:pPr>
+              <w:pStyle w:val="Compact"/>
+            </w:pPr>
+            <w:r>
+              <w:t xml:space="preserve">-0.64</w:t>
+            </w:r>
+          </w:p>
+        </w:tc>
+        <w:tc>
+          <w:tcPr/>
+          <w:p>
+            <w:pPr>
+              <w:pStyle w:val="Compact"/>
+            </w:pPr>
+            <w:r>
+              <w:t xml:space="preserve">+0.0000</w:t>
             </w:r>
           </w:p>
         </w:tc>
@@ -25623,62 +25372,62 @@
               <w:pStyle w:val="Compact"/>
             </w:pPr>
             <w:r>
-              <w:t xml:space="preserve">35%</w:t>
-            </w:r>
-          </w:p>
-        </w:tc>
-        <w:tc>
-          <w:tcPr/>
-          <w:p>
-            <w:pPr>
-              <w:pStyle w:val="Compact"/>
-            </w:pPr>
-            <w:r>
-              <w:t xml:space="preserve">average</w:t>
-            </w:r>
-          </w:p>
-        </w:tc>
-        <w:tc>
-          <w:tcPr/>
-          <w:p>
-            <w:pPr>
-              <w:pStyle w:val="Compact"/>
-            </w:pPr>
-            <w:r>
-              <w:t xml:space="preserve">-0.0962</w:t>
-            </w:r>
-          </w:p>
-        </w:tc>
-        <w:tc>
-          <w:tcPr/>
-          <w:p>
-            <w:pPr>
-              <w:pStyle w:val="Compact"/>
-            </w:pPr>
-            <w:r>
-              <w:t xml:space="preserve">-0.0108</w:t>
-            </w:r>
-          </w:p>
-        </w:tc>
-        <w:tc>
-          <w:tcPr/>
-          <w:p>
-            <w:pPr>
-              <w:pStyle w:val="Compact"/>
-            </w:pPr>
-            <w:r>
-              <w:t xml:space="preserve">-0.78</w:t>
-            </w:r>
-          </w:p>
-        </w:tc>
-        <w:tc>
-          <w:tcPr/>
-          <w:p>
-            <w:pPr>
-              <w:pStyle w:val="Compact"/>
-            </w:pPr>
-            <w:r>
-              <w:t xml:space="preserve">-0.0016</w:t>
+              <w:t xml:space="preserve">0%</w:t>
+            </w:r>
+          </w:p>
+        </w:tc>
+        <w:tc>
+          <w:tcPr/>
+          <w:p>
+            <w:pPr>
+              <w:pStyle w:val="Compact"/>
+            </w:pPr>
+            <w:r>
+              <w:t xml:space="preserve">new</w:t>
+            </w:r>
+          </w:p>
+        </w:tc>
+        <w:tc>
+          <w:tcPr/>
+          <w:p>
+            <w:pPr>
+              <w:pStyle w:val="Compact"/>
+            </w:pPr>
+            <w:r>
+              <w:t xml:space="preserve">-0.0500</w:t>
+            </w:r>
+          </w:p>
+        </w:tc>
+        <w:tc>
+          <w:tcPr/>
+          <w:p>
+            <w:pPr>
+              <w:pStyle w:val="Compact"/>
+            </w:pPr>
+            <w:r>
+              <w:t xml:space="preserve">+0.0060</w:t>
+            </w:r>
+          </w:p>
+        </w:tc>
+        <w:tc>
+          <w:tcPr/>
+          <w:p>
+            <w:pPr>
+              <w:pStyle w:val="Compact"/>
+            </w:pPr>
+            <w:r>
+              <w:t xml:space="preserve">+0.77</w:t>
+            </w:r>
+          </w:p>
+        </w:tc>
+        <w:tc>
+          <w:tcPr/>
+          <w:p>
+            <w:pPr>
+              <w:pStyle w:val="Compact"/>
+            </w:pPr>
+            <w:r>
+              <w:t xml:space="preserve">+0.0000</w:t>
             </w:r>
           </w:p>
         </w:tc>
@@ -25691,62 +25440,62 @@
               <w:pStyle w:val="Compact"/>
             </w:pPr>
             <w:r>
-              <w:t xml:space="preserve">35%</w:t>
-            </w:r>
-          </w:p>
-        </w:tc>
-        <w:tc>
-          <w:tcPr/>
-          <w:p>
-            <w:pPr>
-              <w:pStyle w:val="Compact"/>
-            </w:pPr>
-            <w:r>
-              <w:t xml:space="preserve">new</w:t>
-            </w:r>
-          </w:p>
-        </w:tc>
-        <w:tc>
-          <w:tcPr/>
-          <w:p>
-            <w:pPr>
-              <w:pStyle w:val="Compact"/>
-            </w:pPr>
-            <w:r>
-              <w:t xml:space="preserve">-0.0478</w:t>
-            </w:r>
-          </w:p>
-        </w:tc>
-        <w:tc>
-          <w:tcPr/>
-          <w:p>
-            <w:pPr>
-              <w:pStyle w:val="Compact"/>
-            </w:pPr>
-            <w:r>
-              <w:t xml:space="preserve">+0.0080</w:t>
-            </w:r>
-          </w:p>
-        </w:tc>
-        <w:tc>
-          <w:tcPr/>
-          <w:p>
-            <w:pPr>
-              <w:pStyle w:val="Compact"/>
-            </w:pPr>
-            <w:r>
-              <w:t xml:space="preserve">+1.05</w:t>
-            </w:r>
-          </w:p>
-        </w:tc>
-        <w:tc>
-          <w:tcPr/>
-          <w:p>
-            <w:pPr>
-              <w:pStyle w:val="Compact"/>
-            </w:pPr>
-            <w:r>
-              <w:t xml:space="preserve">+0.0020</w:t>
+              <w:t xml:space="preserve">20%</w:t>
+            </w:r>
+          </w:p>
+        </w:tc>
+        <w:tc>
+          <w:tcPr/>
+          <w:p>
+            <w:pPr>
+              <w:pStyle w:val="Compact"/>
+            </w:pPr>
+            <w:r>
+              <w:t xml:space="preserve">old</w:t>
+            </w:r>
+          </w:p>
+        </w:tc>
+        <w:tc>
+          <w:tcPr/>
+          <w:p>
+            <w:pPr>
+              <w:pStyle w:val="Compact"/>
+            </w:pPr>
+            <w:r>
+              <w:t xml:space="preserve">-1.0066</w:t>
+            </w:r>
+          </w:p>
+        </w:tc>
+        <w:tc>
+          <w:tcPr/>
+          <w:p>
+            <w:pPr>
+              <w:pStyle w:val="Compact"/>
+            </w:pPr>
+            <w:r>
+              <w:t xml:space="preserve">-0.0200</w:t>
+            </w:r>
+          </w:p>
+        </w:tc>
+        <w:tc>
+          <w:tcPr/>
+          <w:p>
+            <w:pPr>
+              <w:pStyle w:val="Compact"/>
+            </w:pPr>
+            <w:r>
+              <w:t xml:space="preserve">-0.20</w:t>
+            </w:r>
+          </w:p>
+        </w:tc>
+        <w:tc>
+          <w:tcPr/>
+          <w:p>
+            <w:pPr>
+              <w:pStyle w:val="Compact"/>
+            </w:pPr>
+            <w:r>
+              <w:t xml:space="preserve">-0.0325</w:t>
             </w:r>
           </w:p>
         </w:tc>
@@ -25759,62 +25508,62 @@
               <w:pStyle w:val="Compact"/>
             </w:pPr>
             <w:r>
-              <w:t xml:space="preserve">50%</w:t>
-            </w:r>
-          </w:p>
-        </w:tc>
-        <w:tc>
-          <w:tcPr/>
-          <w:p>
-            <w:pPr>
-              <w:pStyle w:val="Compact"/>
-            </w:pPr>
-            <w:r>
-              <w:t xml:space="preserve">old</w:t>
-            </w:r>
-          </w:p>
-        </w:tc>
-        <w:tc>
-          <w:tcPr/>
-          <w:p>
-            <w:pPr>
-              <w:pStyle w:val="Compact"/>
-            </w:pPr>
-            <w:r>
-              <w:t xml:space="preserve">-1.0165</w:t>
-            </w:r>
-          </w:p>
-        </w:tc>
-        <w:tc>
-          <w:tcPr/>
-          <w:p>
-            <w:pPr>
-              <w:pStyle w:val="Compact"/>
-            </w:pPr>
-            <w:r>
-              <w:t xml:space="preserve">-0.0366</w:t>
-            </w:r>
-          </w:p>
-        </w:tc>
-        <w:tc>
-          <w:tcPr/>
-          <w:p>
-            <w:pPr>
-              <w:pStyle w:val="Compact"/>
-            </w:pPr>
-            <w:r>
-              <w:t xml:space="preserve">-0.36</w:t>
-            </w:r>
-          </w:p>
-        </w:tc>
-        <w:tc>
-          <w:tcPr/>
-          <w:p>
-            <w:pPr>
-              <w:pStyle w:val="Compact"/>
-            </w:pPr>
-            <w:r>
-              <w:t xml:space="preserve">-0.0490</w:t>
+              <w:t xml:space="preserve">20%</w:t>
+            </w:r>
+          </w:p>
+        </w:tc>
+        <w:tc>
+          <w:tcPr/>
+          <w:p>
+            <w:pPr>
+              <w:pStyle w:val="Compact"/>
+            </w:pPr>
+            <w:r>
+              <w:t xml:space="preserve">average</w:t>
+            </w:r>
+          </w:p>
+        </w:tc>
+        <w:tc>
+          <w:tcPr/>
+          <w:p>
+            <w:pPr>
+              <w:pStyle w:val="Compact"/>
+            </w:pPr>
+            <w:r>
+              <w:t xml:space="preserve">-0.0978</w:t>
+            </w:r>
+          </w:p>
+        </w:tc>
+        <w:tc>
+          <w:tcPr/>
+          <w:p>
+            <w:pPr>
+              <w:pStyle w:val="Compact"/>
+            </w:pPr>
+            <w:r>
+              <w:t xml:space="preserve">-0.0104</w:t>
+            </w:r>
+          </w:p>
+        </w:tc>
+        <w:tc>
+          <w:tcPr/>
+          <w:p>
+            <w:pPr>
+              <w:pStyle w:val="Compact"/>
+            </w:pPr>
+            <w:r>
+              <w:t xml:space="preserve">-0.74</w:t>
+            </w:r>
+          </w:p>
+        </w:tc>
+        <w:tc>
+          <w:tcPr/>
+          <w:p>
+            <w:pPr>
+              <w:pStyle w:val="Compact"/>
+            </w:pPr>
+            <w:r>
+              <w:t xml:space="preserve">-0.0012</w:t>
             </w:r>
           </w:p>
         </w:tc>
@@ -25827,62 +25576,62 @@
               <w:pStyle w:val="Compact"/>
             </w:pPr>
             <w:r>
-              <w:t xml:space="preserve">50%</w:t>
-            </w:r>
-          </w:p>
-        </w:tc>
-        <w:tc>
-          <w:tcPr/>
-          <w:p>
-            <w:pPr>
-              <w:pStyle w:val="Compact"/>
-            </w:pPr>
-            <w:r>
-              <w:t xml:space="preserve">average</w:t>
-            </w:r>
-          </w:p>
-        </w:tc>
-        <w:tc>
-          <w:tcPr/>
-          <w:p>
-            <w:pPr>
-              <w:pStyle w:val="Compact"/>
-            </w:pPr>
-            <w:r>
-              <w:t xml:space="preserve">-0.0946</w:t>
-            </w:r>
-          </w:p>
-        </w:tc>
-        <w:tc>
-          <w:tcPr/>
-          <w:p>
-            <w:pPr>
-              <w:pStyle w:val="Compact"/>
-            </w:pPr>
-            <w:r>
-              <w:t xml:space="preserve">-0.0107</w:t>
-            </w:r>
-          </w:p>
-        </w:tc>
-        <w:tc>
-          <w:tcPr/>
-          <w:p>
-            <w:pPr>
-              <w:pStyle w:val="Compact"/>
-            </w:pPr>
-            <w:r>
-              <w:t xml:space="preserve">-0.79</w:t>
-            </w:r>
-          </w:p>
-        </w:tc>
-        <w:tc>
-          <w:tcPr/>
-          <w:p>
-            <w:pPr>
-              <w:pStyle w:val="Compact"/>
-            </w:pPr>
-            <w:r>
-              <w:t xml:space="preserve">-0.0016</w:t>
+              <w:t xml:space="preserve">20%</w:t>
+            </w:r>
+          </w:p>
+        </w:tc>
+        <w:tc>
+          <w:tcPr/>
+          <w:p>
+            <w:pPr>
+              <w:pStyle w:val="Compact"/>
+            </w:pPr>
+            <w:r>
+              <w:t xml:space="preserve">new</w:t>
+            </w:r>
+          </w:p>
+        </w:tc>
+        <w:tc>
+          <w:tcPr/>
+          <w:p>
+            <w:pPr>
+              <w:pStyle w:val="Compact"/>
+            </w:pPr>
+            <w:r>
+              <w:t xml:space="preserve">-0.0487</w:t>
+            </w:r>
+          </w:p>
+        </w:tc>
+        <w:tc>
+          <w:tcPr/>
+          <w:p>
+            <w:pPr>
+              <w:pStyle w:val="Compact"/>
+            </w:pPr>
+            <w:r>
+              <w:t xml:space="preserve">+0.0071</w:t>
+            </w:r>
+          </w:p>
+        </w:tc>
+        <w:tc>
+          <w:tcPr/>
+          <w:p>
+            <w:pPr>
+              <w:pStyle w:val="Compact"/>
+            </w:pPr>
+            <w:r>
+              <w:t xml:space="preserve">+0.93</w:t>
+            </w:r>
+          </w:p>
+        </w:tc>
+        <w:tc>
+          <w:tcPr/>
+          <w:p>
+            <w:pPr>
+              <w:pStyle w:val="Compact"/>
+            </w:pPr>
+            <w:r>
+              <w:t xml:space="preserve">+0.0011</w:t>
             </w:r>
           </w:p>
         </w:tc>
@@ -25895,6 +25644,346 @@
               <w:pStyle w:val="Compact"/>
             </w:pPr>
             <w:r>
+              <w:t xml:space="preserve">35%</w:t>
+            </w:r>
+          </w:p>
+        </w:tc>
+        <w:tc>
+          <w:tcPr/>
+          <w:p>
+            <w:pPr>
+              <w:pStyle w:val="Compact"/>
+            </w:pPr>
+            <w:r>
+              <w:t xml:space="preserve">old</w:t>
+            </w:r>
+          </w:p>
+        </w:tc>
+        <w:tc>
+          <w:tcPr/>
+          <w:p>
+            <w:pPr>
+              <w:pStyle w:val="Compact"/>
+            </w:pPr>
+            <w:r>
+              <w:t xml:space="preserve">-1.0115</w:t>
+            </w:r>
+          </w:p>
+        </w:tc>
+        <w:tc>
+          <w:tcPr/>
+          <w:p>
+            <w:pPr>
+              <w:pStyle w:val="Compact"/>
+            </w:pPr>
+            <w:r>
+              <w:t xml:space="preserve">-0.0334</w:t>
+            </w:r>
+          </w:p>
+        </w:tc>
+        <w:tc>
+          <w:tcPr/>
+          <w:p>
+            <w:pPr>
+              <w:pStyle w:val="Compact"/>
+            </w:pPr>
+            <w:r>
+              <w:t xml:space="preserve">-0.33</w:t>
+            </w:r>
+          </w:p>
+        </w:tc>
+        <w:tc>
+          <w:tcPr/>
+          <w:p>
+            <w:pPr>
+              <w:pStyle w:val="Compact"/>
+            </w:pPr>
+            <w:r>
+              <w:t xml:space="preserve">-0.0458</w:t>
+            </w:r>
+          </w:p>
+        </w:tc>
+      </w:tr>
+      <w:tr>
+        <w:tc>
+          <w:tcPr/>
+          <w:p>
+            <w:pPr>
+              <w:pStyle w:val="Compact"/>
+            </w:pPr>
+            <w:r>
+              <w:t xml:space="preserve">35%</w:t>
+            </w:r>
+          </w:p>
+        </w:tc>
+        <w:tc>
+          <w:tcPr/>
+          <w:p>
+            <w:pPr>
+              <w:pStyle w:val="Compact"/>
+            </w:pPr>
+            <w:r>
+              <w:t xml:space="preserve">average</w:t>
+            </w:r>
+          </w:p>
+        </w:tc>
+        <w:tc>
+          <w:tcPr/>
+          <w:p>
+            <w:pPr>
+              <w:pStyle w:val="Compact"/>
+            </w:pPr>
+            <w:r>
+              <w:t xml:space="preserve">-0.0962</w:t>
+            </w:r>
+          </w:p>
+        </w:tc>
+        <w:tc>
+          <w:tcPr/>
+          <w:p>
+            <w:pPr>
+              <w:pStyle w:val="Compact"/>
+            </w:pPr>
+            <w:r>
+              <w:t xml:space="preserve">-0.0108</w:t>
+            </w:r>
+          </w:p>
+        </w:tc>
+        <w:tc>
+          <w:tcPr/>
+          <w:p>
+            <w:pPr>
+              <w:pStyle w:val="Compact"/>
+            </w:pPr>
+            <w:r>
+              <w:t xml:space="preserve">-0.78</w:t>
+            </w:r>
+          </w:p>
+        </w:tc>
+        <w:tc>
+          <w:tcPr/>
+          <w:p>
+            <w:pPr>
+              <w:pStyle w:val="Compact"/>
+            </w:pPr>
+            <w:r>
+              <w:t xml:space="preserve">-0.0016</w:t>
+            </w:r>
+          </w:p>
+        </w:tc>
+      </w:tr>
+      <w:tr>
+        <w:tc>
+          <w:tcPr/>
+          <w:p>
+            <w:pPr>
+              <w:pStyle w:val="Compact"/>
+            </w:pPr>
+            <w:r>
+              <w:t xml:space="preserve">35%</w:t>
+            </w:r>
+          </w:p>
+        </w:tc>
+        <w:tc>
+          <w:tcPr/>
+          <w:p>
+            <w:pPr>
+              <w:pStyle w:val="Compact"/>
+            </w:pPr>
+            <w:r>
+              <w:t xml:space="preserve">new</w:t>
+            </w:r>
+          </w:p>
+        </w:tc>
+        <w:tc>
+          <w:tcPr/>
+          <w:p>
+            <w:pPr>
+              <w:pStyle w:val="Compact"/>
+            </w:pPr>
+            <w:r>
+              <w:t xml:space="preserve">-0.0478</w:t>
+            </w:r>
+          </w:p>
+        </w:tc>
+        <w:tc>
+          <w:tcPr/>
+          <w:p>
+            <w:pPr>
+              <w:pStyle w:val="Compact"/>
+            </w:pPr>
+            <w:r>
+              <w:t xml:space="preserve">+0.0080</w:t>
+            </w:r>
+          </w:p>
+        </w:tc>
+        <w:tc>
+          <w:tcPr/>
+          <w:p>
+            <w:pPr>
+              <w:pStyle w:val="Compact"/>
+            </w:pPr>
+            <w:r>
+              <w:t xml:space="preserve">+1.05</w:t>
+            </w:r>
+          </w:p>
+        </w:tc>
+        <w:tc>
+          <w:tcPr/>
+          <w:p>
+            <w:pPr>
+              <w:pStyle w:val="Compact"/>
+            </w:pPr>
+            <w:r>
+              <w:t xml:space="preserve">+0.0020</w:t>
+            </w:r>
+          </w:p>
+        </w:tc>
+      </w:tr>
+      <w:tr>
+        <w:tc>
+          <w:tcPr/>
+          <w:p>
+            <w:pPr>
+              <w:pStyle w:val="Compact"/>
+            </w:pPr>
+            <w:r>
+              <w:t xml:space="preserve">50%</w:t>
+            </w:r>
+          </w:p>
+        </w:tc>
+        <w:tc>
+          <w:tcPr/>
+          <w:p>
+            <w:pPr>
+              <w:pStyle w:val="Compact"/>
+            </w:pPr>
+            <w:r>
+              <w:t xml:space="preserve">old</w:t>
+            </w:r>
+          </w:p>
+        </w:tc>
+        <w:tc>
+          <w:tcPr/>
+          <w:p>
+            <w:pPr>
+              <w:pStyle w:val="Compact"/>
+            </w:pPr>
+            <w:r>
+              <w:t xml:space="preserve">-1.0165</w:t>
+            </w:r>
+          </w:p>
+        </w:tc>
+        <w:tc>
+          <w:tcPr/>
+          <w:p>
+            <w:pPr>
+              <w:pStyle w:val="Compact"/>
+            </w:pPr>
+            <w:r>
+              <w:t xml:space="preserve">-0.0366</w:t>
+            </w:r>
+          </w:p>
+        </w:tc>
+        <w:tc>
+          <w:tcPr/>
+          <w:p>
+            <w:pPr>
+              <w:pStyle w:val="Compact"/>
+            </w:pPr>
+            <w:r>
+              <w:t xml:space="preserve">-0.36</w:t>
+            </w:r>
+          </w:p>
+        </w:tc>
+        <w:tc>
+          <w:tcPr/>
+          <w:p>
+            <w:pPr>
+              <w:pStyle w:val="Compact"/>
+            </w:pPr>
+            <w:r>
+              <w:t xml:space="preserve">-0.0490</w:t>
+            </w:r>
+          </w:p>
+        </w:tc>
+      </w:tr>
+      <w:tr>
+        <w:tc>
+          <w:tcPr/>
+          <w:p>
+            <w:pPr>
+              <w:pStyle w:val="Compact"/>
+            </w:pPr>
+            <w:r>
+              <w:t xml:space="preserve">50%</w:t>
+            </w:r>
+          </w:p>
+        </w:tc>
+        <w:tc>
+          <w:tcPr/>
+          <w:p>
+            <w:pPr>
+              <w:pStyle w:val="Compact"/>
+            </w:pPr>
+            <w:r>
+              <w:t xml:space="preserve">average</w:t>
+            </w:r>
+          </w:p>
+        </w:tc>
+        <w:tc>
+          <w:tcPr/>
+          <w:p>
+            <w:pPr>
+              <w:pStyle w:val="Compact"/>
+            </w:pPr>
+            <w:r>
+              <w:t xml:space="preserve">-0.0946</w:t>
+            </w:r>
+          </w:p>
+        </w:tc>
+        <w:tc>
+          <w:tcPr/>
+          <w:p>
+            <w:pPr>
+              <w:pStyle w:val="Compact"/>
+            </w:pPr>
+            <w:r>
+              <w:t xml:space="preserve">-0.0107</w:t>
+            </w:r>
+          </w:p>
+        </w:tc>
+        <w:tc>
+          <w:tcPr/>
+          <w:p>
+            <w:pPr>
+              <w:pStyle w:val="Compact"/>
+            </w:pPr>
+            <w:r>
+              <w:t xml:space="preserve">-0.79</w:t>
+            </w:r>
+          </w:p>
+        </w:tc>
+        <w:tc>
+          <w:tcPr/>
+          <w:p>
+            <w:pPr>
+              <w:pStyle w:val="Compact"/>
+            </w:pPr>
+            <w:r>
+              <w:t xml:space="preserve">-0.0016</w:t>
+            </w:r>
+          </w:p>
+        </w:tc>
+      </w:tr>
+      <w:tr>
+        <w:tc>
+          <w:tcPr/>
+          <w:p>
+            <w:pPr>
+              <w:pStyle w:val="Compact"/>
+            </w:pPr>
+            <w:r>
               <w:t xml:space="preserve">50%</w:t>
             </w:r>
           </w:p>
@@ -25956,7 +26045,14 @@
         </w:tc>
       </w:tr>
     </w:tbl>
-    <w:p/>
+    <w:p>
+      <w:pPr>
+        <w:pStyle w:val="BodyText"/>
+      </w:pPr>
+      <w:r>
+        <w:t xml:space="preserve">Table E2. The same design repeated over 25 independent heterogeneity fields at plus or minus 20%. The mean increment is a fraction of the field-to-field scatter in every zone, so no systematic bias is distinguishable from the choice of field.</w:t>
+      </w:r>
+    </w:p>
     <w:tbl>
       <w:tblPr>
         <w:tblStyle w:val="Table"/>
@@ -26244,7 +26340,14 @@
         </w:tc>
       </w:tr>
     </w:tbl>
-    <w:p/>
+    <w:p>
+      <w:pPr>
+        <w:pStyle w:val="BodyText"/>
+      </w:pPr>
+      <w:r>
+        <w:t xml:space="preserve">Table E3. Length-structured heterogeneity in the reference realisation. The homogeneous baseline offset is what the same rule returns with no structural error at all and must be subtracted before a shift is read as structural.</w:t>
+      </w:r>
+    </w:p>
     <w:tbl>
       <w:tblPr>
         <w:tblStyle w:val="Table"/>
@@ -26904,6 +27007,14 @@
       </w:pPr>
       <w:r>
         <w:t xml:space="preserve">Appendix F. Per-arm sensor error and drift results</w:t>
+      </w:r>
+    </w:p>
+    <w:p>
+      <w:pPr>
+        <w:pStyle w:val="FirstParagraph"/>
+      </w:pPr>
+      <w:r>
+        <w:t xml:space="preserve">Table F1. Every arm of the sensor-bias sweep under the primary rule, as the displacement of each coefficient in baseline posterior standard deviations. Rank statistics compare the 92-junction risk field with the unbiased case.</w:t>
       </w:r>
     </w:p>
     <w:tbl>
@@ -29729,7 +29840,14 @@
         </w:tc>
       </w:tr>
     </w:tbl>
-    <w:p/>
+    <w:p>
+      <w:pPr>
+        <w:pStyle w:val="BodyText"/>
+      </w:pPr>
+      <w:r>
+        <w:t xml:space="preserve">Table F2. Sensor drift against its mean-equivalent and end-equivalent constant-bias controls on identical noise. A monotone drift acts, to within about a tenth, as a constant bias at its mean over the window.</w:t>
+      </w:r>
+    </w:p>
     <w:tbl>
       <w:tblPr>
         <w:tblStyle w:val="Table"/>
@@ -30471,6 +30589,14 @@
         <w:t xml:space="preserve">Appendix G. Risk-assessment mechanics</w:t>
       </w:r>
     </w:p>
+    <w:p>
+      <w:pPr>
+        <w:pStyle w:val="FirstParagraph"/>
+      </w:pPr>
+      <w:r>
+        <w:t xml:space="preserve">Table G1. Water-age association and the resampling design behind its interval. Whole spatial blocks are resampled rather than individual junctions, because junctions sharing pipes, flow paths and tank states are not independent samples. The interval is a descriptive width, not a significance test.</w:t>
+      </w:r>
+    </w:p>
     <w:tbl>
       <w:tblPr>
         <w:tblStyle w:val="Table"/>
@@ -30702,7 +30828,14 @@
         </w:tc>
       </w:tr>
     </w:tbl>
-    <w:p/>
+    <w:p>
+      <w:pPr>
+        <w:pStyle w:val="BodyText"/>
+      </w:pPr>
+      <w:r>
+        <w:t xml:space="preserve">Table G2. Three network averages for each risk metric. Consumer-only is worse than unweighted while demand-weighted is better, which can only happen if the risk concentrates at small consumers.</w:t>
+      </w:r>
+    </w:p>
     <w:tbl>
       <w:tblPr>
         <w:tblStyle w:val="Table"/>
@@ -30903,7 +31036,14 @@
         </w:tc>
       </w:tr>
     </w:tbl>
-    <w:p/>
+    <w:p>
+      <w:pPr>
+        <w:pStyle w:val="BodyText"/>
+      </w:pPr>
+      <w:r>
+        <w:t xml:space="preserve">Table G3. Scenario draw specification. One draw per retained ensemble member is reused across every scenario and dose as a common random number, so scenario differences are physical rather than Monte Carlo noise.</w:t>
+      </w:r>
+    </w:p>
     <w:tbl>
       <w:tblPr>
         <w:tblStyle w:val="Table"/>
@@ -31191,6 +31331,14 @@
       </w:pPr>
       <w:r>
         <w:t xml:space="preserve">Appendix H. Full risk register</w:t>
+      </w:r>
+    </w:p>
+    <w:p>
+      <w:pPr>
+        <w:pStyle w:val="FirstParagraph"/>
+      </w:pPr>
+      <w:r>
+        <w:t xml:space="preserve">Table H1. The complete risk register, all 92 junctions, ordered by expected cumulative deficit. Banding rules are given in the main text; the governing band is the higher of the breach and severity bands.</w:t>
       </w:r>
     </w:p>
     <w:tbl>

</xml_diff>

<commit_message>
fix(paper): make Appendix I a one-page section-to-script map
The supervisor asked for a one-page mapping; it ran to about three, with
filenames broken mid-word because three columns left none of them enough
width. The artifact column was the cause and carried almost nothing: 22
of the 27 artifacts are the script name with .py replaced by .json.

That rule is now stated once in prose, with the five departures listed,
and the table is two columns at a 27/73 split. Verified against the
cache: every script in the table except the five named exceptions writes
exactly baseline_cache/<script name>.json. The longest unbreakable token
is 31 characters in a 10.1 cm column, so nothing splits mid-word; four
rows wrap at a comma.

Page count not verified here — no renderer on this machine. Check in
Word before sending.

Co-Authored-By: Claude Opus 5 (1M context) <noreply@anthropic.com>
</commit_message>
<xml_diff>
--- a/00-thesis/paper.docx
+++ b/00-thesis/paper.docx
@@ -38788,6 +38788,212 @@
         <w:t xml:space="preserve">cross-checks the written numbers against the artifacts.</w:t>
       </w:r>
     </w:p>
+    <w:p>
+      <w:pPr>
+        <w:pStyle w:val="BodyText"/>
+      </w:pPr>
+      <w:r>
+        <w:t xml:space="preserve">Each script writes</w:t>
+      </w:r>
+      <w:r>
+        <w:t xml:space="preserve"> </w:t>
+      </w:r>
+      <w:r>
+        <w:rPr>
+          <w:rStyle w:val="VerbatimChar"/>
+        </w:rPr>
+        <w:t xml:space="preserve">Net3/baseline_cache/&lt;script name&gt;.json</w:t>
+      </w:r>
+      <w:r>
+        <w:t xml:space="preserve">, so the artifact column that would</w:t>
+      </w:r>
+      <w:r>
+        <w:t xml:space="preserve"> </w:t>
+      </w:r>
+      <w:r>
+        <w:t xml:space="preserve">otherwise repeat this table is omitted. Five entries depart from that rule:</w:t>
+      </w:r>
+      <w:r>
+        <w:t xml:space="preserve"> </w:t>
+      </w:r>
+      <w:r>
+        <w:rPr>
+          <w:rStyle w:val="VerbatimChar"/>
+        </w:rPr>
+        <w:t xml:space="preserve">step1_freeze_baseline.py</w:t>
+      </w:r>
+      <w:r>
+        <w:t xml:space="preserve"> </w:t>
+      </w:r>
+      <w:r>
+        <w:t xml:space="preserve">writes</w:t>
+      </w:r>
+      <w:r>
+        <w:t xml:space="preserve"> </w:t>
+      </w:r>
+      <w:r>
+        <w:rPr>
+          <w:rStyle w:val="VerbatimChar"/>
+        </w:rPr>
+        <w:t xml:space="preserve">baseline_meta.json</w:t>
+      </w:r>
+      <w:r>
+        <w:t xml:space="preserve"> </w:t>
+      </w:r>
+      <w:r>
+        <w:t xml:space="preserve">and</w:t>
+      </w:r>
+      <w:r>
+        <w:t xml:space="preserve"> </w:t>
+      </w:r>
+      <w:r>
+        <w:rPr>
+          <w:rStyle w:val="VerbatimChar"/>
+        </w:rPr>
+        <w:t xml:space="preserve">baseline.npz</w:t>
+      </w:r>
+      <w:r>
+        <w:t xml:space="preserve">;</w:t>
+      </w:r>
+      <w:r>
+        <w:t xml:space="preserve"> </w:t>
+      </w:r>
+      <w:r>
+        <w:rPr>
+          <w:rStyle w:val="VerbatimChar"/>
+        </w:rPr>
+        <w:t xml:space="preserve">step3_threshold_sensitivity.py</w:t>
+      </w:r>
+      <w:r>
+        <w:t xml:space="preserve"> </w:t>
+      </w:r>
+      <w:r>
+        <w:t xml:space="preserve">writes</w:t>
+      </w:r>
+      <w:r>
+        <w:t xml:space="preserve"> </w:t>
+      </w:r>
+      <w:r>
+        <w:rPr>
+          <w:rStyle w:val="VerbatimChar"/>
+        </w:rPr>
+        <w:t xml:space="preserve">step3_threshold.json</w:t>
+      </w:r>
+      <w:r>
+        <w:t xml:space="preserve">;</w:t>
+      </w:r>
+      <w:r>
+        <w:t xml:space="preserve"> </w:t>
+      </w:r>
+      <w:r>
+        <w:rPr>
+          <w:rStyle w:val="VerbatimChar"/>
+        </w:rPr>
+        <w:t xml:space="preserve">step12_scenarios.py</w:t>
+      </w:r>
+      <w:r>
+        <w:t xml:space="preserve"> </w:t>
+      </w:r>
+      <w:r>
+        <w:t xml:space="preserve">also writes</w:t>
+      </w:r>
+      <w:r>
+        <w:t xml:space="preserve"> </w:t>
+      </w:r>
+      <w:r>
+        <w:rPr>
+          <w:rStyle w:val="VerbatimChar"/>
+        </w:rPr>
+        <w:t xml:space="preserve">step12_risk_register.csv</w:t>
+      </w:r>
+      <w:r>
+        <w:t xml:space="preserve">;</w:t>
+      </w:r>
+      <w:r>
+        <w:t xml:space="preserve"> </w:t>
+      </w:r>
+      <w:r>
+        <w:rPr>
+          <w:rStyle w:val="VerbatimChar"/>
+        </w:rPr>
+        <w:t xml:space="preserve">paper_figs.py</w:t>
+      </w:r>
+      <w:r>
+        <w:t xml:space="preserve"> </w:t>
+      </w:r>
+      <w:r>
+        <w:t xml:space="preserve">and</w:t>
+      </w:r>
+      <w:r>
+        <w:t xml:space="preserve"> </w:t>
+      </w:r>
+      <w:r>
+        <w:rPr>
+          <w:rStyle w:val="VerbatimChar"/>
+        </w:rPr>
+        <w:t xml:space="preserve">appendix_tables.py</w:t>
+      </w:r>
+      <w:r>
+        <w:t xml:space="preserve"> </w:t>
+      </w:r>
+      <w:r>
+        <w:t xml:space="preserve">write into</w:t>
+      </w:r>
+      <w:r>
+        <w:t xml:space="preserve"> </w:t>
+      </w:r>
+      <w:r>
+        <w:rPr>
+          <w:rStyle w:val="VerbatimChar"/>
+        </w:rPr>
+        <w:t xml:space="preserve">Net3/Figures/paper/</w:t>
+      </w:r>
+      <w:r>
+        <w:t xml:space="preserve">; and</w:t>
+      </w:r>
+      <w:r>
+        <w:t xml:space="preserve"> </w:t>
+      </w:r>
+      <w:r>
+        <w:rPr>
+          <w:rStyle w:val="VerbatimChar"/>
+        </w:rPr>
+        <w:t xml:space="preserve">provenance.py</w:t>
+      </w:r>
+      <w:r>
+        <w:t xml:space="preserve"> </w:t>
+      </w:r>
+      <w:r>
+        <w:t xml:space="preserve">writes</w:t>
+      </w:r>
+      <w:r>
+        <w:t xml:space="preserve"> </w:t>
+      </w:r>
+      <w:r>
+        <w:rPr>
+          <w:rStyle w:val="VerbatimChar"/>
+        </w:rPr>
+        <w:t xml:space="preserve">cache_manifest.json</w:t>
+      </w:r>
+      <w:r>
+        <w:t xml:space="preserve">, which</w:t>
+      </w:r>
+      <w:r>
+        <w:t xml:space="preserve"> </w:t>
+      </w:r>
+      <w:r>
+        <w:rPr>
+          <w:rStyle w:val="VerbatimChar"/>
+        </w:rPr>
+        <w:t xml:space="preserve">validate_artifacts.py</w:t>
+      </w:r>
+      <w:r>
+        <w:t xml:space="preserve"> </w:t>
+      </w:r>
+      <w:r>
+        <w:t xml:space="preserve">reads without writing an artifact of its own.</w:t>
+      </w:r>
+    </w:p>
     <w:tbl>
       <w:tblPr>
         <w:tblStyle w:val="Table"/>
@@ -38796,9 +39002,8 @@
         <w:tblLook w:firstRow="1" w:lastRow="0" w:firstColumn="0" w:lastColumn="0" w:noHBand="0" w:noVBand="0" w:val="0020"/>
       </w:tblPr>
       <w:tblGrid>
-        <w:gridCol w:w="2640"/>
-        <w:gridCol w:w="2640"/>
-        <w:gridCol w:w="2640"/>
+        <w:gridCol w:w="2169"/>
+        <w:gridCol w:w="5750"/>
       </w:tblGrid>
       <w:tr>
         <w:trPr>
@@ -38826,17 +39031,6 @@
             </w:r>
           </w:p>
         </w:tc>
-        <w:tc>
-          <w:tcPr/>
-          <w:p>
-            <w:pPr>
-              <w:pStyle w:val="Compact"/>
-            </w:pPr>
-            <w:r>
-              <w:t xml:space="preserve">Artifact</w:t>
-            </w:r>
-          </w:p>
-        </w:tc>
       </w:tr>
       <w:tr>
         <w:tc>
@@ -38864,20 +39058,6 @@
             </w:r>
           </w:p>
         </w:tc>
-        <w:tc>
-          <w:tcPr/>
-          <w:p>
-            <w:pPr>
-              <w:pStyle w:val="Compact"/>
-            </w:pPr>
-            <w:r>
-              <w:rPr>
-                <w:rStyle w:val="VerbatimChar"/>
-              </w:rPr>
-              <w:t xml:space="preserve">step0_warmup_convergence.json</w:t>
-            </w:r>
-          </w:p>
-        </w:tc>
       </w:tr>
       <w:tr>
         <w:tc>
@@ -38917,32 +39097,6 @@
             </w:r>
           </w:p>
         </w:tc>
-        <w:tc>
-          <w:tcPr/>
-          <w:p>
-            <w:pPr>
-              <w:pStyle w:val="Compact"/>
-            </w:pPr>
-            <w:r>
-              <w:rPr>
-                <w:rStyle w:val="VerbatimChar"/>
-              </w:rPr>
-              <w:t xml:space="preserve">step13_known_answer.json</w:t>
-            </w:r>
-            <w:r>
-              <w:t xml:space="preserve">,</w:t>
-            </w:r>
-            <w:r>
-              <w:t xml:space="preserve"> </w:t>
-            </w:r>
-            <w:r>
-              <w:rPr>
-                <w:rStyle w:val="VerbatimChar"/>
-              </w:rPr>
-              <w:t xml:space="preserve">step15_unit_equivalence.json</w:t>
-            </w:r>
-          </w:p>
-        </w:tc>
       </w:tr>
       <w:tr>
         <w:tc>
@@ -38970,32 +39124,6 @@
             </w:r>
           </w:p>
         </w:tc>
-        <w:tc>
-          <w:tcPr/>
-          <w:p>
-            <w:pPr>
-              <w:pStyle w:val="Compact"/>
-            </w:pPr>
-            <w:r>
-              <w:rPr>
-                <w:rStyle w:val="VerbatimChar"/>
-              </w:rPr>
-              <w:t xml:space="preserve">baseline_meta.json</w:t>
-            </w:r>
-            <w:r>
-              <w:t xml:space="preserve">,</w:t>
-            </w:r>
-            <w:r>
-              <w:t xml:space="preserve"> </w:t>
-            </w:r>
-            <w:r>
-              <w:rPr>
-                <w:rStyle w:val="VerbatimChar"/>
-              </w:rPr>
-              <w:t xml:space="preserve">baseline.npz</w:t>
-            </w:r>
-          </w:p>
-        </w:tc>
       </w:tr>
       <w:tr>
         <w:tc>
@@ -39035,32 +39163,6 @@
             </w:r>
           </w:p>
         </w:tc>
-        <w:tc>
-          <w:tcPr/>
-          <w:p>
-            <w:pPr>
-              <w:pStyle w:val="Compact"/>
-            </w:pPr>
-            <w:r>
-              <w:rPr>
-                <w:rStyle w:val="VerbatimChar"/>
-              </w:rPr>
-              <w:t xml:space="preserve">step3_threshold.json</w:t>
-            </w:r>
-            <w:r>
-              <w:t xml:space="preserve">,</w:t>
-            </w:r>
-            <w:r>
-              <w:t xml:space="preserve"> </w:t>
-            </w:r>
-            <w:r>
-              <w:rPr>
-                <w:rStyle w:val="VerbatimChar"/>
-              </w:rPr>
-              <w:t xml:space="preserve">step4d_displaced_robust.json</w:t>
-            </w:r>
-          </w:p>
-        </w:tc>
       </w:tr>
       <w:tr>
         <w:tc>
@@ -39088,20 +39190,6 @@
             </w:r>
           </w:p>
         </w:tc>
-        <w:tc>
-          <w:tcPr/>
-          <w:p>
-            <w:pPr>
-              <w:pStyle w:val="Compact"/>
-            </w:pPr>
-            <w:r>
-              <w:rPr>
-                <w:rStyle w:val="VerbatimChar"/>
-              </w:rPr>
-              <w:t xml:space="preserve">step7_fisher.json</w:t>
-            </w:r>
-          </w:p>
-        </w:tc>
       </w:tr>
       <w:tr>
         <w:tc>
@@ -39129,20 +39217,6 @@
             </w:r>
           </w:p>
         </w:tc>
-        <w:tc>
-          <w:tcPr/>
-          <w:p>
-            <w:pPr>
-              <w:pStyle w:val="Compact"/>
-            </w:pPr>
-            <w:r>
-              <w:rPr>
-                <w:rStyle w:val="VerbatimChar"/>
-              </w:rPr>
-              <w:t xml:space="preserve">step7b_profile.json</w:t>
-            </w:r>
-          </w:p>
-        </w:tc>
       </w:tr>
       <w:tr>
         <w:tc>
@@ -39170,20 +39244,6 @@
             </w:r>
           </w:p>
         </w:tc>
-        <w:tc>
-          <w:tcPr/>
-          <w:p>
-            <w:pPr>
-              <w:pStyle w:val="Compact"/>
-            </w:pPr>
-            <w:r>
-              <w:rPr>
-                <w:rStyle w:val="VerbatimChar"/>
-              </w:rPr>
-              <w:t xml:space="preserve">step6_noise_sensitivity.json</w:t>
-            </w:r>
-          </w:p>
-        </w:tc>
       </w:tr>
       <w:tr>
         <w:tc>
@@ -39223,32 +39283,6 @@
             </w:r>
           </w:p>
         </w:tc>
-        <w:tc>
-          <w:tcPr/>
-          <w:p>
-            <w:pPr>
-              <w:pStyle w:val="Compact"/>
-            </w:pPr>
-            <w:r>
-              <w:rPr>
-                <w:rStyle w:val="VerbatimChar"/>
-              </w:rPr>
-              <w:t xml:space="preserve">step7c_ar1.json</w:t>
-            </w:r>
-            <w:r>
-              <w:t xml:space="preserve">,</w:t>
-            </w:r>
-            <w:r>
-              <w:t xml:space="preserve"> </w:t>
-            </w:r>
-            <w:r>
-              <w:rPr>
-                <w:rStyle w:val="VerbatimChar"/>
-              </w:rPr>
-              <w:t xml:space="preserve">step7c_profile_ar1.json</w:t>
-            </w:r>
-          </w:p>
-        </w:tc>
       </w:tr>
       <w:tr>
         <w:tc>
@@ -39300,44 +39334,6 @@
             </w:r>
           </w:p>
         </w:tc>
-        <w:tc>
-          <w:tcPr/>
-          <w:p>
-            <w:pPr>
-              <w:pStyle w:val="Compact"/>
-            </w:pPr>
-            <w:r>
-              <w:rPr>
-                <w:rStyle w:val="VerbatimChar"/>
-              </w:rPr>
-              <w:t xml:space="preserve">step8_sensor_bias.json</w:t>
-            </w:r>
-            <w:r>
-              <w:t xml:space="preserve">,</w:t>
-            </w:r>
-            <w:r>
-              <w:t xml:space="preserve"> </w:t>
-            </w:r>
-            <w:r>
-              <w:rPr>
-                <w:rStyle w:val="VerbatimChar"/>
-              </w:rPr>
-              <w:t xml:space="preserve">step8c_bias_bynode.json</w:t>
-            </w:r>
-            <w:r>
-              <w:t xml:space="preserve">,</w:t>
-            </w:r>
-            <w:r>
-              <w:t xml:space="preserve"> </w:t>
-            </w:r>
-            <w:r>
-              <w:rPr>
-                <w:rStyle w:val="VerbatimChar"/>
-              </w:rPr>
-              <w:t xml:space="preserve">step8d_sensor_drift.json</w:t>
-            </w:r>
-          </w:p>
-        </w:tc>
       </w:tr>
       <w:tr>
         <w:tc>
@@ -39365,20 +39361,6 @@
             </w:r>
           </w:p>
         </w:tc>
-        <w:tc>
-          <w:tcPr/>
-          <w:p>
-            <w:pPr>
-              <w:pStyle w:val="Compact"/>
-            </w:pPr>
-            <w:r>
-              <w:rPr>
-                <w:rStyle w:val="VerbatimChar"/>
-              </w:rPr>
-              <w:t xml:space="preserve">step8b_kb_sensitivity.json</w:t>
-            </w:r>
-          </w:p>
-        </w:tc>
       </w:tr>
       <w:tr>
         <w:tc>
@@ -39430,32 +39412,6 @@
             </w:r>
           </w:p>
         </w:tc>
-        <w:tc>
-          <w:tcPr/>
-          <w:p>
-            <w:pPr>
-              <w:pStyle w:val="Compact"/>
-            </w:pPr>
-            <w:r>
-              <w:rPr>
-                <w:rStyle w:val="VerbatimChar"/>
-              </w:rPr>
-              <w:t xml:space="preserve">step5c_jitter_sweep.json</w:t>
-            </w:r>
-            <w:r>
-              <w:t xml:space="preserve">,</w:t>
-            </w:r>
-            <w:r>
-              <w:t xml:space="preserve"> </w:t>
-            </w:r>
-            <w:r>
-              <w:rPr>
-                <w:rStyle w:val="VerbatimChar"/>
-              </w:rPr>
-              <w:t xml:space="preserve">step5d_structured.json</w:t>
-            </w:r>
-          </w:p>
-        </w:tc>
       </w:tr>
       <w:tr>
         <w:tc>
@@ -39483,20 +39439,6 @@
             </w:r>
           </w:p>
         </w:tc>
-        <w:tc>
-          <w:tcPr/>
-          <w:p>
-            <w:pPr>
-              <w:pStyle w:val="Compact"/>
-            </w:pPr>
-            <w:r>
-              <w:rPr>
-                <w:rStyle w:val="VerbatimChar"/>
-              </w:rPr>
-              <w:t xml:space="preserve">step11_loo.json</w:t>
-            </w:r>
-          </w:p>
-        </w:tc>
       </w:tr>
       <w:tr>
         <w:tc>
@@ -39536,44 +39478,6 @@
             </w:r>
           </w:p>
         </w:tc>
-        <w:tc>
-          <w:tcPr/>
-          <w:p>
-            <w:pPr>
-              <w:pStyle w:val="Compact"/>
-            </w:pPr>
-            <w:r>
-              <w:rPr>
-                <w:rStyle w:val="VerbatimChar"/>
-              </w:rPr>
-              <w:t xml:space="preserve">step10_risk_metrics.json</w:t>
-            </w:r>
-            <w:r>
-              <w:t xml:space="preserve">,</w:t>
-            </w:r>
-            <w:r>
-              <w:t xml:space="preserve"> </w:t>
-            </w:r>
-            <w:r>
-              <w:rPr>
-                <w:rStyle w:val="VerbatimChar"/>
-              </w:rPr>
-              <w:t xml:space="preserve">step12_scenarios.json</w:t>
-            </w:r>
-            <w:r>
-              <w:t xml:space="preserve">,</w:t>
-            </w:r>
-            <w:r>
-              <w:t xml:space="preserve"> </w:t>
-            </w:r>
-            <w:r>
-              <w:rPr>
-                <w:rStyle w:val="VerbatimChar"/>
-              </w:rPr>
-              <w:t xml:space="preserve">step12_risk_register.csv</w:t>
-            </w:r>
-          </w:p>
-        </w:tc>
       </w:tr>
       <w:tr>
         <w:tc>
@@ -39601,20 +39505,6 @@
             </w:r>
           </w:p>
         </w:tc>
-        <w:tc>
-          <w:tcPr/>
-          <w:p>
-            <w:pPr>
-              <w:pStyle w:val="Compact"/>
-            </w:pPr>
-            <w:r>
-              <w:rPr>
-                <w:rStyle w:val="VerbatimChar"/>
-              </w:rPr>
-              <w:t xml:space="preserve">step14_repeated_noise.json</w:t>
-            </w:r>
-          </w:p>
-        </w:tc>
       </w:tr>
       <w:tr>
         <w:tc>
@@ -39642,20 +39532,6 @@
             </w:r>
           </w:p>
         </w:tc>
-        <w:tc>
-          <w:tcPr/>
-          <w:p>
-            <w:pPr>
-              <w:pStyle w:val="Compact"/>
-            </w:pPr>
-            <w:r>
-              <w:rPr>
-                <w:rStyle w:val="VerbatimChar"/>
-              </w:rPr>
-              <w:t xml:space="preserve">Figures/paper/</w:t>
-            </w:r>
-          </w:p>
-        </w:tc>
       </w:tr>
       <w:tr>
         <w:tc>
@@ -39683,20 +39559,6 @@
             </w:r>
           </w:p>
         </w:tc>
-        <w:tc>
-          <w:tcPr/>
-          <w:p>
-            <w:pPr>
-              <w:pStyle w:val="Compact"/>
-            </w:pPr>
-            <w:r>
-              <w:rPr>
-                <w:rStyle w:val="VerbatimChar"/>
-              </w:rPr>
-              <w:t xml:space="preserve">Figures/paper/appendix_tables.md</w:t>
-            </w:r>
-          </w:p>
-        </w:tc>
       </w:tr>
       <w:tr>
         <w:tc>
@@ -39733,20 +39595,6 @@
                 <w:rStyle w:val="VerbatimChar"/>
               </w:rPr>
               <w:t xml:space="preserve">validate_artifacts.py</w:t>
-            </w:r>
-          </w:p>
-        </w:tc>
-        <w:tc>
-          <w:tcPr/>
-          <w:p>
-            <w:pPr>
-              <w:pStyle w:val="Compact"/>
-            </w:pPr>
-            <w:r>
-              <w:rPr>
-                <w:rStyle w:val="VerbatimChar"/>
-              </w:rPr>
-              <w:t xml:space="preserve">cache_manifest.json</w:t>
             </w:r>
           </w:p>
         </w:tc>

</xml_diff>

<commit_message>
fix(paper): define the risk bands, and stop calling the informal spread a posterior
Appendix H's caption said the banding rules were given in the main text.
They were not: the paper never states the likelihood edges on P_min, the
severity edges on E[D], the demand terciles behind the consequence
score, the score product, or the mapping from score to band. The
register's last three columns could not be read.

They are now Table H1, generated from step12_scenarios.json rather than
transcribed, so the printed scale cannot drift from the one the code
applied. The register becomes H2. Being a table, it adds nothing to the
word count.

Figure 2's caption still called the bars a posterior standard deviation,
which contradicted Table 3 after that caption was corrected: under the
informal score the quantity is a weighted-ensemble spread, not a
posterior.

Co-Authored-By: Claude Opus 5 (1M context) <noreply@anthropic.com>
</commit_message>
<xml_diff>
--- a/00-thesis/paper.docx
+++ b/00-thesis/paper.docx
@@ -13324,7 +13324,7 @@
           <wp:inline>
             <wp:extent cx="4661377" cy="3840938"/>
             <wp:effectExtent b="0" l="0" r="0" t="0"/>
-            <wp:docPr descr="Figure 2. Inference formulation determines apparent identifiability. Weighted densities under the uniform prior, the primary censored likelihood and the informal score at two thresholds, with dashed rules at the true values. Bars give the posterior standard deviation as a percentage of the prior." title="" id="60" name="Picture"/>
+            <wp:docPr descr="Figure 2. Inference formulation determines apparent identifiability. Weighted densities under the uniform prior, the primary censored likelihood and the informal score at two thresholds, with dashed rules at the true values. Bars give the weighted-ensemble standard deviation as a percentage of the prior, which is a posterior standard deviation only under the two formal likelihoods." title="" id="60" name="Picture"/>
             <a:graphic>
               <a:graphicData uri="http://schemas.openxmlformats.org/drawingml/2006/picture">
                 <pic:pic>
@@ -13383,7 +13383,7 @@
         <w:t xml:space="preserve"> </w:t>
       </w:r>
       <w:r>
-        <w:t xml:space="preserve">Weighted densities under the uniform prior, the primary censored likelihood and the informal score at two thresholds, with dashed rules at the true values. Bars give the posterior standard deviation as a percentage of the prior.</w:t>
+        <w:t xml:space="preserve">Weighted densities under the uniform prior, the primary censored likelihood and the informal score at two thresholds, with dashed rules at the true values. Bars give the weighted-ensemble standard deviation as a percentage of the prior, which is a posterior standard deviation only under the two formal likelihoods.</w:t>
       </w:r>
     </w:p>
     <w:p>
@@ -31130,13 +31130,13 @@
       </w:tr>
     </w:tbl>
     <w:bookmarkEnd w:id="140"/>
-    <w:bookmarkStart w:id="141" w:name="appendix-h.-full-risk-register"/>
+    <w:bookmarkStart w:id="141" w:name="Xc0b2899ea87b71e9f8a5d7e226fe2b64e1dc44b"/>
     <w:p>
       <w:pPr>
         <w:pStyle w:val="Heading2"/>
       </w:pPr>
       <w:r>
-        <w:t xml:space="preserve">Appendix H. Full risk register</w:t>
+        <w:t xml:space="preserve">Appendix H. Risk banding and the full register</w:t>
       </w:r>
     </w:p>
     <w:p>
@@ -31144,7 +31144,706 @@
         <w:pStyle w:val="FirstParagraph"/>
       </w:pPr>
       <w:r>
-        <w:t xml:space="preserve">Table H1. The complete risk register, all 92 junctions, ordered by expected cumulative deficit. Banding rules are given in the main text; the governing band is the higher of the breach and severity bands.</w:t>
+        <w:t xml:space="preserve">Table H1. Risk banding. The likelihood and severity axes are scored 1 to 5 on the criteria below and consequence 0 to 3; a risk score is the axis score times the consequence score, and the band follows from that score. The severity edges are pre-declared hours rather than quantiles of this network’s own results, so the same scale applies across scenarios. The governing band is the higher of the breach-probability band and the severity band, since neither axis alone may reduce an action.</w:t>
+      </w:r>
+    </w:p>
+    <w:tbl>
+      <w:tblPr>
+        <w:tblStyle w:val="Table"/>
+        <w:tblW w:type="pct" w:w="5000"/>
+        <w:tblLayout w:type="fixed"/>
+        <w:tblLook w:firstRow="1" w:lastRow="0" w:firstColumn="0" w:lastColumn="0" w:noHBand="0" w:noVBand="0" w:val="0020"/>
+      </w:tblPr>
+      <w:tblGrid>
+        <w:gridCol w:w="2640"/>
+        <w:gridCol w:w="2640"/>
+        <w:gridCol w:w="2640"/>
+      </w:tblGrid>
+      <w:tr>
+        <w:trPr>
+          <w:tblHeader w:val="on"/>
+        </w:trPr>
+        <w:tc>
+          <w:tcPr/>
+          <w:p>
+            <w:pPr>
+              <w:pStyle w:val="Compact"/>
+            </w:pPr>
+            <w:r>
+              <w:t xml:space="preserve">Axis</w:t>
+            </w:r>
+          </w:p>
+        </w:tc>
+        <w:tc>
+          <w:tcPr/>
+          <w:p>
+            <w:pPr>
+              <w:pStyle w:val="Compact"/>
+            </w:pPr>
+            <w:r>
+              <w:t xml:space="preserve">Band</w:t>
+            </w:r>
+          </w:p>
+        </w:tc>
+        <w:tc>
+          <w:tcPr/>
+          <w:p>
+            <w:pPr>
+              <w:pStyle w:val="Compact"/>
+            </w:pPr>
+            <w:r>
+              <w:t xml:space="preserve">Criterion</w:t>
+            </w:r>
+          </w:p>
+        </w:tc>
+      </w:tr>
+      <w:tr>
+        <w:tc>
+          <w:tcPr/>
+          <w:p>
+            <w:pPr>
+              <w:pStyle w:val="Compact"/>
+            </w:pPr>
+            <w:r>
+              <w:t xml:space="preserve">Likelihood, from</w:t>
+            </w:r>
+            <w:r>
+              <w:t xml:space="preserve"> </w:t>
+            </w:r>
+            <m:oMath>
+              <m:sSub>
+                <m:e>
+                  <m:r>
+                    <m:t>P</m:t>
+                  </m:r>
+                </m:e>
+                <m:sub>
+                  <m:r>
+                    <m:rPr>
+                      <m:sty m:val="p"/>
+                    </m:rPr>
+                    <m:t>min</m:t>
+                  </m:r>
+                </m:sub>
+              </m:sSub>
+            </m:oMath>
+          </w:p>
+        </w:tc>
+        <w:tc>
+          <w:tcPr/>
+          <w:p>
+            <w:pPr>
+              <w:pStyle w:val="Compact"/>
+            </w:pPr>
+            <w:r>
+              <w:t xml:space="preserve">rare</w:t>
+            </w:r>
+          </w:p>
+        </w:tc>
+        <w:tc>
+          <w:tcPr/>
+          <w:p>
+            <w:pPr>
+              <w:pStyle w:val="Compact"/>
+            </w:pPr>
+            <w:r>
+              <w:t xml:space="preserve">P_min &lt; 0.05</w:t>
+            </w:r>
+          </w:p>
+        </w:tc>
+      </w:tr>
+      <w:tr>
+        <w:tc>
+          <w:tcPr/>
+          <w:p>
+            <w:pPr>
+              <w:pStyle w:val="Compact"/>
+            </w:pPr>
+          </w:p>
+        </w:tc>
+        <w:tc>
+          <w:tcPr/>
+          <w:p>
+            <w:pPr>
+              <w:pStyle w:val="Compact"/>
+            </w:pPr>
+            <w:r>
+              <w:t xml:space="preserve">unlikely</w:t>
+            </w:r>
+          </w:p>
+        </w:tc>
+        <w:tc>
+          <w:tcPr/>
+          <w:p>
+            <w:pPr>
+              <w:pStyle w:val="Compact"/>
+            </w:pPr>
+            <w:r>
+              <w:t xml:space="preserve">0.05 &lt;= P_min &lt; 0.20</w:t>
+            </w:r>
+          </w:p>
+        </w:tc>
+      </w:tr>
+      <w:tr>
+        <w:tc>
+          <w:tcPr/>
+          <w:p>
+            <w:pPr>
+              <w:pStyle w:val="Compact"/>
+            </w:pPr>
+          </w:p>
+        </w:tc>
+        <w:tc>
+          <w:tcPr/>
+          <w:p>
+            <w:pPr>
+              <w:pStyle w:val="Compact"/>
+            </w:pPr>
+            <w:r>
+              <w:t xml:space="preserve">possible</w:t>
+            </w:r>
+          </w:p>
+        </w:tc>
+        <w:tc>
+          <w:tcPr/>
+          <w:p>
+            <w:pPr>
+              <w:pStyle w:val="Compact"/>
+            </w:pPr>
+            <w:r>
+              <w:t xml:space="preserve">0.20 &lt;= P_min &lt; 0.50</w:t>
+            </w:r>
+          </w:p>
+        </w:tc>
+      </w:tr>
+      <w:tr>
+        <w:tc>
+          <w:tcPr/>
+          <w:p>
+            <w:pPr>
+              <w:pStyle w:val="Compact"/>
+            </w:pPr>
+          </w:p>
+        </w:tc>
+        <w:tc>
+          <w:tcPr/>
+          <w:p>
+            <w:pPr>
+              <w:pStyle w:val="Compact"/>
+            </w:pPr>
+            <w:r>
+              <w:t xml:space="preserve">likely</w:t>
+            </w:r>
+          </w:p>
+        </w:tc>
+        <w:tc>
+          <w:tcPr/>
+          <w:p>
+            <w:pPr>
+              <w:pStyle w:val="Compact"/>
+            </w:pPr>
+            <w:r>
+              <w:t xml:space="preserve">0.50 &lt;= P_min &lt; 0.80</w:t>
+            </w:r>
+          </w:p>
+        </w:tc>
+      </w:tr>
+      <w:tr>
+        <w:tc>
+          <w:tcPr/>
+          <w:p>
+            <w:pPr>
+              <w:pStyle w:val="Compact"/>
+            </w:pPr>
+          </w:p>
+        </w:tc>
+        <w:tc>
+          <w:tcPr/>
+          <w:p>
+            <w:pPr>
+              <w:pStyle w:val="Compact"/>
+            </w:pPr>
+            <w:r>
+              <w:t xml:space="preserve">almost certain</w:t>
+            </w:r>
+          </w:p>
+        </w:tc>
+        <w:tc>
+          <w:tcPr/>
+          <w:p>
+            <w:pPr>
+              <w:pStyle w:val="Compact"/>
+            </w:pPr>
+            <w:r>
+              <w:t xml:space="preserve">P_min &gt;= 0.80</w:t>
+            </w:r>
+          </w:p>
+        </w:tc>
+      </w:tr>
+      <w:tr>
+        <w:tc>
+          <w:tcPr/>
+          <w:p>
+            <w:pPr>
+              <w:pStyle w:val="Compact"/>
+            </w:pPr>
+            <w:r>
+              <w:t xml:space="preserve">Severity, from E[D]</w:t>
+            </w:r>
+          </w:p>
+        </w:tc>
+        <w:tc>
+          <w:tcPr/>
+          <w:p>
+            <w:pPr>
+              <w:pStyle w:val="Compact"/>
+            </w:pPr>
+            <w:r>
+              <w:t xml:space="preserve">negligible</w:t>
+            </w:r>
+          </w:p>
+        </w:tc>
+        <w:tc>
+          <w:tcPr/>
+          <w:p>
+            <w:pPr>
+              <w:pStyle w:val="Compact"/>
+            </w:pPr>
+            <w:r>
+              <w:t xml:space="preserve">E[D] &lt; 1 h</w:t>
+            </w:r>
+          </w:p>
+        </w:tc>
+      </w:tr>
+      <w:tr>
+        <w:tc>
+          <w:tcPr/>
+          <w:p>
+            <w:pPr>
+              <w:pStyle w:val="Compact"/>
+            </w:pPr>
+          </w:p>
+        </w:tc>
+        <w:tc>
+          <w:tcPr/>
+          <w:p>
+            <w:pPr>
+              <w:pStyle w:val="Compact"/>
+            </w:pPr>
+            <w:r>
+              <w:t xml:space="preserve">brief</w:t>
+            </w:r>
+          </w:p>
+        </w:tc>
+        <w:tc>
+          <w:tcPr/>
+          <w:p>
+            <w:pPr>
+              <w:pStyle w:val="Compact"/>
+            </w:pPr>
+            <w:r>
+              <w:t xml:space="preserve">1 &lt;= E[D] &lt; 6 h</w:t>
+            </w:r>
+          </w:p>
+        </w:tc>
+      </w:tr>
+      <w:tr>
+        <w:tc>
+          <w:tcPr/>
+          <w:p>
+            <w:pPr>
+              <w:pStyle w:val="Compact"/>
+            </w:pPr>
+          </w:p>
+        </w:tc>
+        <w:tc>
+          <w:tcPr/>
+          <w:p>
+            <w:pPr>
+              <w:pStyle w:val="Compact"/>
+            </w:pPr>
+            <w:r>
+              <w:t xml:space="preserve">sustained</w:t>
+            </w:r>
+          </w:p>
+        </w:tc>
+        <w:tc>
+          <w:tcPr/>
+          <w:p>
+            <w:pPr>
+              <w:pStyle w:val="Compact"/>
+            </w:pPr>
+            <w:r>
+              <w:t xml:space="preserve">6 &lt;= E[D] &lt; 12 h</w:t>
+            </w:r>
+          </w:p>
+        </w:tc>
+      </w:tr>
+      <w:tr>
+        <w:tc>
+          <w:tcPr/>
+          <w:p>
+            <w:pPr>
+              <w:pStyle w:val="Compact"/>
+            </w:pPr>
+          </w:p>
+        </w:tc>
+        <w:tc>
+          <w:tcPr/>
+          <w:p>
+            <w:pPr>
+              <w:pStyle w:val="Compact"/>
+            </w:pPr>
+            <w:r>
+              <w:t xml:space="preserve">prolonged</w:t>
+            </w:r>
+          </w:p>
+        </w:tc>
+        <w:tc>
+          <w:tcPr/>
+          <w:p>
+            <w:pPr>
+              <w:pStyle w:val="Compact"/>
+            </w:pPr>
+            <w:r>
+              <w:t xml:space="preserve">12 &lt;= E[D] &lt; 24 h</w:t>
+            </w:r>
+          </w:p>
+        </w:tc>
+      </w:tr>
+      <w:tr>
+        <w:tc>
+          <w:tcPr/>
+          <w:p>
+            <w:pPr>
+              <w:pStyle w:val="Compact"/>
+            </w:pPr>
+          </w:p>
+        </w:tc>
+        <w:tc>
+          <w:tcPr/>
+          <w:p>
+            <w:pPr>
+              <w:pStyle w:val="Compact"/>
+            </w:pPr>
+            <w:r>
+              <w:t xml:space="preserve">persistent</w:t>
+            </w:r>
+          </w:p>
+        </w:tc>
+        <w:tc>
+          <w:tcPr/>
+          <w:p>
+            <w:pPr>
+              <w:pStyle w:val="Compact"/>
+            </w:pPr>
+            <w:r>
+              <w:t xml:space="preserve">E[D] &gt;= 24 h (half the assessment window or more)</w:t>
+            </w:r>
+          </w:p>
+        </w:tc>
+      </w:tr>
+      <w:tr>
+        <w:tc>
+          <w:tcPr/>
+          <w:p>
+            <w:pPr>
+              <w:pStyle w:val="Compact"/>
+            </w:pPr>
+            <w:r>
+              <w:t xml:space="preserve">Consequence, from demand</w:t>
+            </w:r>
+          </w:p>
+        </w:tc>
+        <w:tc>
+          <w:tcPr/>
+          <w:p>
+            <w:pPr>
+              <w:pStyle w:val="Compact"/>
+            </w:pPr>
+            <w:r>
+              <w:t xml:space="preserve">non-consumer</w:t>
+            </w:r>
+          </w:p>
+        </w:tc>
+        <w:tc>
+          <w:tcPr/>
+          <w:p>
+            <w:pPr>
+              <w:pStyle w:val="Compact"/>
+            </w:pPr>
+            <w:r>
+              <w:t xml:space="preserve">d = 0, a non-consumer junction</w:t>
+            </w:r>
+          </w:p>
+        </w:tc>
+      </w:tr>
+      <w:tr>
+        <w:tc>
+          <w:tcPr/>
+          <w:p>
+            <w:pPr>
+              <w:pStyle w:val="Compact"/>
+            </w:pPr>
+          </w:p>
+        </w:tc>
+        <w:tc>
+          <w:tcPr/>
+          <w:p>
+            <w:pPr>
+              <w:pStyle w:val="Compact"/>
+            </w:pPr>
+            <w:r>
+              <w:t xml:space="preserve">minor</w:t>
+            </w:r>
+          </w:p>
+        </w:tc>
+        <w:tc>
+          <w:tcPr/>
+          <w:p>
+            <w:pPr>
+              <w:pStyle w:val="Compact"/>
+            </w:pPr>
+            <w:r>
+              <w:t xml:space="preserve">0 &lt; d &lt;= 1.67 L/s</w:t>
+            </w:r>
+          </w:p>
+        </w:tc>
+      </w:tr>
+      <w:tr>
+        <w:tc>
+          <w:tcPr/>
+          <w:p>
+            <w:pPr>
+              <w:pStyle w:val="Compact"/>
+            </w:pPr>
+          </w:p>
+        </w:tc>
+        <w:tc>
+          <w:tcPr/>
+          <w:p>
+            <w:pPr>
+              <w:pStyle w:val="Compact"/>
+            </w:pPr>
+            <w:r>
+              <w:t xml:space="preserve">moderate</w:t>
+            </w:r>
+          </w:p>
+        </w:tc>
+        <w:tc>
+          <w:tcPr/>
+          <w:p>
+            <w:pPr>
+              <w:pStyle w:val="Compact"/>
+            </w:pPr>
+            <w:r>
+              <w:t xml:space="preserve">1.67 &lt; d &lt;= 4.38 L/s</w:t>
+            </w:r>
+          </w:p>
+        </w:tc>
+      </w:tr>
+      <w:tr>
+        <w:tc>
+          <w:tcPr/>
+          <w:p>
+            <w:pPr>
+              <w:pStyle w:val="Compact"/>
+            </w:pPr>
+          </w:p>
+        </w:tc>
+        <w:tc>
+          <w:tcPr/>
+          <w:p>
+            <w:pPr>
+              <w:pStyle w:val="Compact"/>
+            </w:pPr>
+            <w:r>
+              <w:t xml:space="preserve">major</w:t>
+            </w:r>
+          </w:p>
+        </w:tc>
+        <w:tc>
+          <w:tcPr/>
+          <w:p>
+            <w:pPr>
+              <w:pStyle w:val="Compact"/>
+            </w:pPr>
+            <w:r>
+              <w:t xml:space="preserve">d &gt; 4.38 L/s</w:t>
+            </w:r>
+          </w:p>
+        </w:tc>
+      </w:tr>
+      <w:tr>
+        <w:tc>
+          <w:tcPr/>
+          <w:p>
+            <w:pPr>
+              <w:pStyle w:val="Compact"/>
+            </w:pPr>
+            <w:r>
+              <w:t xml:space="preserve">Risk band, from score</w:t>
+            </w:r>
+          </w:p>
+        </w:tc>
+        <w:tc>
+          <w:tcPr/>
+          <w:p>
+            <w:pPr>
+              <w:pStyle w:val="Compact"/>
+            </w:pPr>
+            <w:r>
+              <w:t xml:space="preserve">not applicable</w:t>
+            </w:r>
+          </w:p>
+        </w:tc>
+        <w:tc>
+          <w:tcPr/>
+          <w:p>
+            <w:pPr>
+              <w:pStyle w:val="Compact"/>
+            </w:pPr>
+            <w:r>
+              <w:t xml:space="preserve">score = 0</w:t>
+            </w:r>
+          </w:p>
+        </w:tc>
+      </w:tr>
+      <w:tr>
+        <w:tc>
+          <w:tcPr/>
+          <w:p>
+            <w:pPr>
+              <w:pStyle w:val="Compact"/>
+            </w:pPr>
+          </w:p>
+        </w:tc>
+        <w:tc>
+          <w:tcPr/>
+          <w:p>
+            <w:pPr>
+              <w:pStyle w:val="Compact"/>
+            </w:pPr>
+            <w:r>
+              <w:t xml:space="preserve">low</w:t>
+            </w:r>
+          </w:p>
+        </w:tc>
+        <w:tc>
+          <w:tcPr/>
+          <w:p>
+            <w:pPr>
+              <w:pStyle w:val="Compact"/>
+            </w:pPr>
+            <w:r>
+              <w:t xml:space="preserve">1 &lt;= score &lt;= 3</w:t>
+            </w:r>
+          </w:p>
+        </w:tc>
+      </w:tr>
+      <w:tr>
+        <w:tc>
+          <w:tcPr/>
+          <w:p>
+            <w:pPr>
+              <w:pStyle w:val="Compact"/>
+            </w:pPr>
+          </w:p>
+        </w:tc>
+        <w:tc>
+          <w:tcPr/>
+          <w:p>
+            <w:pPr>
+              <w:pStyle w:val="Compact"/>
+            </w:pPr>
+            <w:r>
+              <w:t xml:space="preserve">medium</w:t>
+            </w:r>
+          </w:p>
+        </w:tc>
+        <w:tc>
+          <w:tcPr/>
+          <w:p>
+            <w:pPr>
+              <w:pStyle w:val="Compact"/>
+            </w:pPr>
+            <w:r>
+              <w:t xml:space="preserve">4 &lt;= score &lt;= 6</w:t>
+            </w:r>
+          </w:p>
+        </w:tc>
+      </w:tr>
+      <w:tr>
+        <w:tc>
+          <w:tcPr/>
+          <w:p>
+            <w:pPr>
+              <w:pStyle w:val="Compact"/>
+            </w:pPr>
+          </w:p>
+        </w:tc>
+        <w:tc>
+          <w:tcPr/>
+          <w:p>
+            <w:pPr>
+              <w:pStyle w:val="Compact"/>
+            </w:pPr>
+            <w:r>
+              <w:t xml:space="preserve">high</w:t>
+            </w:r>
+          </w:p>
+        </w:tc>
+        <w:tc>
+          <w:tcPr/>
+          <w:p>
+            <w:pPr>
+              <w:pStyle w:val="Compact"/>
+            </w:pPr>
+            <w:r>
+              <w:t xml:space="preserve">7 &lt;= score &lt;= 9</w:t>
+            </w:r>
+          </w:p>
+        </w:tc>
+      </w:tr>
+      <w:tr>
+        <w:tc>
+          <w:tcPr/>
+          <w:p>
+            <w:pPr>
+              <w:pStyle w:val="Compact"/>
+            </w:pPr>
+          </w:p>
+        </w:tc>
+        <w:tc>
+          <w:tcPr/>
+          <w:p>
+            <w:pPr>
+              <w:pStyle w:val="Compact"/>
+            </w:pPr>
+            <w:r>
+              <w:t xml:space="preserve">very high</w:t>
+            </w:r>
+          </w:p>
+        </w:tc>
+        <w:tc>
+          <w:tcPr/>
+          <w:p>
+            <w:pPr>
+              <w:pStyle w:val="Compact"/>
+            </w:pPr>
+            <w:r>
+              <w:t xml:space="preserve">score &gt;= 10</w:t>
+            </w:r>
+          </w:p>
+        </w:tc>
+      </w:tr>
+    </w:tbl>
+    <w:p>
+      <w:pPr>
+        <w:pStyle w:val="BodyText"/>
+      </w:pPr>
+      <w:r>
+        <w:t xml:space="preserve">Table H2. The complete risk register, all 92 junctions, ordered by expected cumulative deficit. Bands are defined in Table H1.</w:t>
       </w:r>
     </w:p>
     <w:tbl>

</xml_diff>

<commit_message>
docs(paper): final reduction, under the 12,000 limit
12,152 -> 11,997 counted. 3 words under.

Eight cuts, each a statement the paper already makes elsewhere:

  3.1.3  the Section 3.4 forward pointer, made again in 3.4.2
  3.5.1  the rhetorical opening, made in 1.3, and a closing clause
         that is 3.5.3's own heading
  3.5.3  the external-validity paragraph, near-verbatim in 3.7.3's
         first limitation, now a cross-reference
  3.6.1  the operational motivation, made in 1.1 and 2.8.1
  3.6.3  the Scenario A null check compressed, and a dosing sentence
         that restated the one before it

No result, caveat or number is dropped. 43/43 claims verified.

The margin is 3 words, which is not a margin. Anything added from here
has to be paid for.

Co-Authored-By: Claude Opus 5 (1M context) <noreply@anthropic.com>
</commit_message>
<xml_diff>
--- a/00-thesis/paper.docx
+++ b/00-thesis/paper.docx
@@ -11772,7 +11772,13 @@
         <w:t xml:space="preserve"> </w:t>
       </w:r>
       <w:r>
-        <w:t xml:space="preserve">aggregate residual is attainable, not that the corresponding parameter vector is correctly identified. Small residual differences accumulated over 294 observations may still carry</w:t>
+        <w:t xml:space="preserve">aggregate residual is attainable, not that the corresponding parameter vector is correctly</w:t>
+      </w:r>
+      <w:r>
+        <w:t xml:space="preserve"> </w:t>
+      </w:r>
+      <w:r>
+        <w:t xml:space="preserve">identified. Small residual differences accumulated over 294 observations may still carry</w:t>
       </w:r>
       <w:r>
         <w:t xml:space="preserve"> </w:t>
@@ -11784,19 +11790,7 @@
         <w:t xml:space="preserve"> </w:t>
       </w:r>
       <w:r>
-        <w:t xml:space="preserve">weighting rules actually extract. It also motivates, without establishing, the</w:t>
-      </w:r>
-      <w:r>
-        <w:t xml:space="preserve"> </w:t>
-      </w:r>
-      <w:r>
-        <w:t xml:space="preserve">precise-but-biased case of Section 3.4, where good residual fit survives a structurally</w:t>
-      </w:r>
-      <w:r>
-        <w:t xml:space="preserve"> </w:t>
-      </w:r>
-      <w:r>
-        <w:t xml:space="preserve">displaced coefficient.</w:t>
+        <w:t xml:space="preserve">weighting rules extract.</w:t>
       </w:r>
     </w:p>
     <w:p>
@@ -11852,19 +11846,13 @@
         <w:t xml:space="preserve"> </w:t>
       </w:r>
       <w:r>
-        <w:t xml:space="preserve">in the new zone. Censoring is thus concentrated in the low-residual part of the network, the</w:t>
-      </w:r>
-      <w:r>
-        <w:t xml:space="preserve"> </w:t>
-      </w:r>
-      <w:r>
-        <w:t xml:space="preserve">region most relevant to the threshold-based risk analysis that follows, and is handled</w:t>
-      </w:r>
-      <w:r>
-        <w:t xml:space="preserve"> </w:t>
-      </w:r>
-      <w:r>
-        <w:t xml:space="preserve">explicitly in the primary likelihood.</w:t>
+        <w:t xml:space="preserve">in the new zone. Censoring is thus concentrated in the part of the network most relevant to the threshold-based</w:t>
+      </w:r>
+      <w:r>
+        <w:t xml:space="preserve"> </w:t>
+      </w:r>
+      <w:r>
+        <w:t xml:space="preserve">risk analysis that follows, and is handled explicitly in the primary likelihood.</w:t>
       </w:r>
     </w:p>
     <w:p>
@@ -16068,13 +16056,7 @@
         <w:pStyle w:val="FirstParagraph"/>
       </w:pPr>
       <w:r>
-        <w:t xml:space="preserve">If a calibrated model predicts well at a sensor it never saw, the calibration is often taken to</w:t>
-      </w:r>
-      <w:r>
-        <w:t xml:space="preserve"> </w:t>
-      </w:r>
-      <w:r>
-        <w:t xml:space="preserve">be validated. Withholding each of the six monitors in turn and refitting gives held-out RMSEs</w:t>
+        <w:t xml:space="preserve">Withholding each of the six monitors in turn and refitting gives held-out RMSEs</w:t>
       </w:r>
       <w:r>
         <w:t xml:space="preserve"> </w:t>
@@ -16157,13 +16139,7 @@
         <w:t xml:space="preserve"> </w:t>
       </w:r>
       <w:r>
-        <w:t xml:space="preserve">information and still predict concentrations about as well, which is a first indication that</w:t>
-      </w:r>
-      <w:r>
-        <w:t xml:space="preserve"> </w:t>
-      </w:r>
-      <w:r>
-        <w:t xml:space="preserve">predictive adequacy and parameter identification are distinct properties.</w:t>
+        <w:t xml:space="preserve">information and still predict concentrations about as well.</w:t>
       </w:r>
     </w:p>
     <w:bookmarkEnd w:id="82"/>
@@ -16356,7 +16332,7 @@
         <w:pStyle w:val="FirstParagraph"/>
       </w:pPr>
       <w:r>
-        <w:t xml:space="preserve">The two claims support different uses. Held-out prediction supports spatial prediction at unseen</w:t>
+        <w:t xml:space="preserve">Held-out prediction supports spatial prediction at unseen</w:t>
       </w:r>
       <w:r>
         <w:t xml:space="preserve"> </w:t>
@@ -16374,39 +16350,13 @@
         <w:t xml:space="preserve"> </w:t>
       </w:r>
       <w:r>
-        <w:t xml:space="preserve">intervention whose design depends on which zone is reactive. For those, Section 3.5.2 shows the evidence may be absent while every predictive diagnostic passes. A model adequate for</w:t>
-      </w:r>
-      <w:r>
-        <w:t xml:space="preserve"> </w:t>
-      </w:r>
-      <w:r>
-        <w:t xml:space="preserve">concentration screening may still be inadequate for asset diagnosis.</w:t>
-      </w:r>
-    </w:p>
-    <w:p>
-      <w:pPr>
-        <w:pStyle w:val="BodyText"/>
-      </w:pPr>
-      <w:r>
-        <w:t xml:space="preserve">Nor is this an external validation. Even the heterogeneous-truth extension retains the same</w:t>
-      </w:r>
-      <w:r>
-        <w:t xml:space="preserve"> </w:t>
-      </w:r>
-      <w:r>
-        <w:t xml:space="preserve">underlying hydraulics, the same first-order reaction family and the same solver, and no field</w:t>
-      </w:r>
-      <w:r>
-        <w:t xml:space="preserve"> </w:t>
-      </w:r>
-      <w:r>
-        <w:t xml:space="preserve">observations are used. The exercise establishes internal predictive consistency, not</w:t>
-      </w:r>
-      <w:r>
-        <w:t xml:space="preserve"> </w:t>
-      </w:r>
-      <w:r>
-        <w:t xml:space="preserve">real-network validity.</w:t>
+        <w:t xml:space="preserve">intervention whose design depends on which zone is reactive. For those, Section 3.5.2 shows the evidence may be absent while every predictive diagnostic</w:t>
+      </w:r>
+      <w:r>
+        <w:t xml:space="preserve"> </w:t>
+      </w:r>
+      <w:r>
+        <w:t xml:space="preserve">passes. Nor is any of this an external validation, for the reasons set out in Section 3.7.3.</w:t>
       </w:r>
     </w:p>
     <w:p>
@@ -17280,25 +17230,19 @@
         <w:pStyle w:val="FirstParagraph"/>
       </w:pPr>
       <w:r>
-        <w:t xml:space="preserve">Calibration uncertainty matters operationally when it changes estimated risk or the</w:t>
-      </w:r>
-      <w:r>
-        <w:t xml:space="preserve"> </w:t>
-      </w:r>
-      <w:r>
-        <w:t xml:space="preserve">prioritisation of locations for action, so the ensemble was propagated to the network and</w:t>
-      </w:r>
-      <w:r>
-        <w:t xml:space="preserve"> </w:t>
-      </w:r>
-      <w:r>
-        <w:t xml:space="preserve">summarised with several metrics rather than one. The values in this section carry the baseline</w:t>
-      </w:r>
-      <w:r>
-        <w:t xml:space="preserve"> </w:t>
-      </w:r>
-      <w:r>
-        <w:t xml:space="preserve">weights and are conditional on its single reference observation realisation. Node 145 spends 12.0 h below 0.2 mg L</w:t>
+        <w:t xml:space="preserve">The ensemble was propagated to all 92 junctions and summarised with several metrics rather than</w:t>
+      </w:r>
+      <w:r>
+        <w:t xml:space="preserve"> </w:t>
+      </w:r>
+      <w:r>
+        <w:t xml:space="preserve">one. The values in this section carry the baseline weights and are conditional on its single</w:t>
+      </w:r>
+      <w:r>
+        <w:t xml:space="preserve"> </w:t>
+      </w:r>
+      <w:r>
+        <w:t xml:space="preserve">reference observation realisation. Node 145 spends 12.0 h below 0.2 mg L</w:t>
       </w:r>
       <w:r>
         <w:rPr>
@@ -17594,19 +17538,19 @@
         <w:t xml:space="preserve"> </w:t>
       </w:r>
       <w:r>
-        <w:t xml:space="preserve">illustrative stress-test assumptions. Scenario A reproduces the 12 degree Celsius baseline but</w:t>
-      </w:r>
-      <w:r>
-        <w:t xml:space="preserve"> </w:t>
-      </w:r>
-      <w:r>
-        <w:t xml:space="preserve">includes the prescribed temperature uncertainty around that reference, shifting the network-mean</w:t>
-      </w:r>
-      <w:r>
-        <w:t xml:space="preserve"> </w:t>
-      </w:r>
-      <w:r>
-        <w:t xml:space="preserve">cumulative deficit from the fixed-temperature 0.218 mg L</w:t>
+        <w:t xml:space="preserve">illustrative stress-test assumptions. Adding the prescribed temperature uncertainty at the 12</w:t>
+      </w:r>
+      <w:r>
+        <w:t xml:space="preserve"> </w:t>
+      </w:r>
+      <w:r>
+        <w:t xml:space="preserve">degree Celsius baseline moves the network-mean cumulative deficit only from 0.218 to</w:t>
+      </w:r>
+      <w:r>
+        <w:t xml:space="preserve"> </w:t>
+      </w:r>
+      <w:r>
+        <w:t xml:space="preserve">0.222 mg L</w:t>
       </w:r>
       <w:r>
         <w:rPr>
@@ -17618,25 +17562,7 @@
         <w:t xml:space="preserve"> </w:t>
       </w:r>
       <w:r>
-        <w:t xml:space="preserve">h of Section 3.6.1 to 0.222 while</w:t>
-      </w:r>
-      <w:r>
-        <w:t xml:space="preserve"> </w:t>
-      </w:r>
-      <w:r>
-        <w:t xml:space="preserve">leaving the 21-junction breach count and 55.4 L s</w:t>
-      </w:r>
-      <w:r>
-        <w:rPr>
-          <w:vertAlign w:val="superscript"/>
-        </w:rPr>
-        <w:t xml:space="preserve">-1</w:t>
-      </w:r>
-      <w:r>
-        <w:t xml:space="preserve"> </w:t>
-      </w:r>
-      <w:r>
-        <w:t xml:space="preserve">of demand at risk unchanged.</w:t>
+        <w:t xml:space="preserve">h, leaving the breach count and demand at risk unchanged.</w:t>
       </w:r>
     </w:p>
     <w:p>
@@ -17775,19 +17701,13 @@
         <w:t xml:space="preserve"> </w:t>
       </w:r>
       <w:r>
-        <w:t xml:space="preserve">55.4. Dosing improves the continuous severity metrics without restoring the baseline</w:t>
-      </w:r>
-      <w:r>
-        <w:t xml:space="preserve"> </w:t>
-      </w:r>
-      <w:r>
-        <w:t xml:space="preserve">demand-at-risk level; the identical figure at both doses is a plateau of the binary</w:t>
-      </w:r>
-      <w:r>
-        <w:t xml:space="preserve"> </w:t>
-      </w:r>
-      <w:r>
-        <w:t xml:space="preserve">classification, not evidence that the extra 15% achieved nothing. The ageing multipliers are illustrative, no by-product, taste or booster constraint is represented, and absolute severities inherit the horizon dependence of Section 3.1.2. Maps</w:t>
+        <w:t xml:space="preserve">55.4. The identical figure at both doses is a plateau of the binary classification, not evidence</w:t>
+      </w:r>
+      <w:r>
+        <w:t xml:space="preserve"> </w:t>
+      </w:r>
+      <w:r>
+        <w:t xml:space="preserve">that the extra 15% achieved nothing. The ageing multipliers are illustrative, no by-product, taste or booster constraint is represented, and absolute severities inherit the horizon dependence of Section 3.1.2. Maps</w:t>
       </w:r>
       <w:r>
         <w:t xml:space="preserve"> </w:t>

</xml_diff>

<commit_message>
fix(paper): restore the antecedent in Appendix I
The cross-section dependency sentence was inserted between the naming
rule and its exceptions, so "Five entries depart from that rule" pointed
at the wrong sentence. The exceptions now follow the rule they belong
to, and the dependency is its own paragraph.

Co-Authored-By: Claude Opus 5 (1M context) <noreply@anthropic.com>
</commit_message>
<xml_diff>
--- a/00-thesis/paper.docx
+++ b/00-thesis/paper.docx
@@ -39426,7 +39426,195 @@
         <w:t xml:space="preserve"> </w:t>
       </w:r>
       <w:r>
-        <w:t xml:space="preserve">otherwise repeat this table is omitted. One cross-section dependency is worth naming: every</w:t>
+        <w:t xml:space="preserve">otherwise repeat this table is omitted. Five entries depart from that naming rule.</w:t>
+      </w:r>
+      <w:r>
+        <w:t xml:space="preserve"> </w:t>
+      </w:r>
+      <w:r>
+        <w:rPr>
+          <w:rStyle w:val="VerbatimChar"/>
+        </w:rPr>
+        <w:t xml:space="preserve">step1_freeze_baseline.py</w:t>
+      </w:r>
+      <w:r>
+        <w:t xml:space="preserve"> </w:t>
+      </w:r>
+      <w:r>
+        <w:t xml:space="preserve">writes</w:t>
+      </w:r>
+      <w:r>
+        <w:t xml:space="preserve"> </w:t>
+      </w:r>
+      <w:r>
+        <w:rPr>
+          <w:rStyle w:val="VerbatimChar"/>
+        </w:rPr>
+        <w:t xml:space="preserve">baseline_meta.json</w:t>
+      </w:r>
+      <w:r>
+        <w:t xml:space="preserve"> </w:t>
+      </w:r>
+      <w:r>
+        <w:t xml:space="preserve">and</w:t>
+      </w:r>
+      <w:r>
+        <w:t xml:space="preserve"> </w:t>
+      </w:r>
+      <w:r>
+        <w:rPr>
+          <w:rStyle w:val="VerbatimChar"/>
+        </w:rPr>
+        <w:t xml:space="preserve">baseline.npz</w:t>
+      </w:r>
+      <w:r>
+        <w:t xml:space="preserve">;</w:t>
+      </w:r>
+      <w:r>
+        <w:t xml:space="preserve"> </w:t>
+      </w:r>
+      <w:r>
+        <w:rPr>
+          <w:rStyle w:val="VerbatimChar"/>
+        </w:rPr>
+        <w:t xml:space="preserve">step3_threshold_sensitivity.py</w:t>
+      </w:r>
+      <w:r>
+        <w:t xml:space="preserve"> </w:t>
+      </w:r>
+      <w:r>
+        <w:t xml:space="preserve">writes</w:t>
+      </w:r>
+      <w:r>
+        <w:t xml:space="preserve"> </w:t>
+      </w:r>
+      <w:r>
+        <w:rPr>
+          <w:rStyle w:val="VerbatimChar"/>
+        </w:rPr>
+        <w:t xml:space="preserve">step3_threshold.json</w:t>
+      </w:r>
+      <w:r>
+        <w:t xml:space="preserve">;</w:t>
+      </w:r>
+      <w:r>
+        <w:t xml:space="preserve"> </w:t>
+      </w:r>
+      <w:r>
+        <w:rPr>
+          <w:rStyle w:val="VerbatimChar"/>
+        </w:rPr>
+        <w:t xml:space="preserve">step12_scenarios.py</w:t>
+      </w:r>
+      <w:r>
+        <w:t xml:space="preserve"> </w:t>
+      </w:r>
+      <w:r>
+        <w:t xml:space="preserve">also writes</w:t>
+      </w:r>
+      <w:r>
+        <w:t xml:space="preserve"> </w:t>
+      </w:r>
+      <w:r>
+        <w:rPr>
+          <w:rStyle w:val="VerbatimChar"/>
+        </w:rPr>
+        <w:t xml:space="preserve">step12_risk_register.csv</w:t>
+      </w:r>
+      <w:r>
+        <w:t xml:space="preserve">;</w:t>
+      </w:r>
+      <w:r>
+        <w:t xml:space="preserve"> </w:t>
+      </w:r>
+      <w:r>
+        <w:rPr>
+          <w:rStyle w:val="VerbatimChar"/>
+        </w:rPr>
+        <w:t xml:space="preserve">paper_figs.py</w:t>
+      </w:r>
+      <w:r>
+        <w:t xml:space="preserve"> </w:t>
+      </w:r>
+      <w:r>
+        <w:t xml:space="preserve">and</w:t>
+      </w:r>
+      <w:r>
+        <w:t xml:space="preserve"> </w:t>
+      </w:r>
+      <w:r>
+        <w:rPr>
+          <w:rStyle w:val="VerbatimChar"/>
+        </w:rPr>
+        <w:t xml:space="preserve">appendix_tables.py</w:t>
+      </w:r>
+      <w:r>
+        <w:t xml:space="preserve"> </w:t>
+      </w:r>
+      <w:r>
+        <w:t xml:space="preserve">write into</w:t>
+      </w:r>
+      <w:r>
+        <w:t xml:space="preserve"> </w:t>
+      </w:r>
+      <w:r>
+        <w:rPr>
+          <w:rStyle w:val="VerbatimChar"/>
+        </w:rPr>
+        <w:t xml:space="preserve">Net3/Figures/paper/</w:t>
+      </w:r>
+      <w:r>
+        <w:t xml:space="preserve">; and</w:t>
+      </w:r>
+      <w:r>
+        <w:t xml:space="preserve"> </w:t>
+      </w:r>
+      <w:r>
+        <w:rPr>
+          <w:rStyle w:val="VerbatimChar"/>
+        </w:rPr>
+        <w:t xml:space="preserve">provenance.py</w:t>
+      </w:r>
+      <w:r>
+        <w:t xml:space="preserve"> </w:t>
+      </w:r>
+      <w:r>
+        <w:t xml:space="preserve">writes</w:t>
+      </w:r>
+      <w:r>
+        <w:t xml:space="preserve"> </w:t>
+      </w:r>
+      <w:r>
+        <w:rPr>
+          <w:rStyle w:val="VerbatimChar"/>
+        </w:rPr>
+        <w:t xml:space="preserve">cache_manifest.json</w:t>
+      </w:r>
+      <w:r>
+        <w:t xml:space="preserve">, which</w:t>
+      </w:r>
+      <w:r>
+        <w:t xml:space="preserve"> </w:t>
+      </w:r>
+      <w:r>
+        <w:rPr>
+          <w:rStyle w:val="VerbatimChar"/>
+        </w:rPr>
+        <w:t xml:space="preserve">validate_artifacts.py</w:t>
+      </w:r>
+      <w:r>
+        <w:t xml:space="preserve"> </w:t>
+      </w:r>
+      <w:r>
+        <w:t xml:space="preserve">reads without writing an artifact of its own.</w:t>
+      </w:r>
+    </w:p>
+    <w:p>
+      <w:pPr>
+        <w:pStyle w:val="BodyText"/>
+      </w:pPr>
+      <w:r>
+        <w:t xml:space="preserve">One dependency crosses sections and is easy to miss when reproducing a single result. Every</w:t>
       </w:r>
       <w:r>
         <w:t xml:space="preserve"> </w:t>
@@ -39453,187 +39641,7 @@
         <w:t xml:space="preserve"> </w:t>
       </w:r>
       <w:r>
-        <w:t xml:space="preserve">writes, not by the standard deviation of the run being reported. Five entries depart from that rule:</w:t>
-      </w:r>
-      <w:r>
-        <w:t xml:space="preserve"> </w:t>
-      </w:r>
-      <w:r>
-        <w:rPr>
-          <w:rStyle w:val="VerbatimChar"/>
-        </w:rPr>
-        <w:t xml:space="preserve">step1_freeze_baseline.py</w:t>
-      </w:r>
-      <w:r>
-        <w:t xml:space="preserve"> </w:t>
-      </w:r>
-      <w:r>
-        <w:t xml:space="preserve">writes</w:t>
-      </w:r>
-      <w:r>
-        <w:t xml:space="preserve"> </w:t>
-      </w:r>
-      <w:r>
-        <w:rPr>
-          <w:rStyle w:val="VerbatimChar"/>
-        </w:rPr>
-        <w:t xml:space="preserve">baseline_meta.json</w:t>
-      </w:r>
-      <w:r>
-        <w:t xml:space="preserve"> </w:t>
-      </w:r>
-      <w:r>
-        <w:t xml:space="preserve">and</w:t>
-      </w:r>
-      <w:r>
-        <w:t xml:space="preserve"> </w:t>
-      </w:r>
-      <w:r>
-        <w:rPr>
-          <w:rStyle w:val="VerbatimChar"/>
-        </w:rPr>
-        <w:t xml:space="preserve">baseline.npz</w:t>
-      </w:r>
-      <w:r>
-        <w:t xml:space="preserve">;</w:t>
-      </w:r>
-      <w:r>
-        <w:t xml:space="preserve"> </w:t>
-      </w:r>
-      <w:r>
-        <w:rPr>
-          <w:rStyle w:val="VerbatimChar"/>
-        </w:rPr>
-        <w:t xml:space="preserve">step3_threshold_sensitivity.py</w:t>
-      </w:r>
-      <w:r>
-        <w:t xml:space="preserve"> </w:t>
-      </w:r>
-      <w:r>
-        <w:t xml:space="preserve">writes</w:t>
-      </w:r>
-      <w:r>
-        <w:t xml:space="preserve"> </w:t>
-      </w:r>
-      <w:r>
-        <w:rPr>
-          <w:rStyle w:val="VerbatimChar"/>
-        </w:rPr>
-        <w:t xml:space="preserve">step3_threshold.json</w:t>
-      </w:r>
-      <w:r>
-        <w:t xml:space="preserve">;</w:t>
-      </w:r>
-      <w:r>
-        <w:t xml:space="preserve"> </w:t>
-      </w:r>
-      <w:r>
-        <w:rPr>
-          <w:rStyle w:val="VerbatimChar"/>
-        </w:rPr>
-        <w:t xml:space="preserve">step12_scenarios.py</w:t>
-      </w:r>
-      <w:r>
-        <w:t xml:space="preserve"> </w:t>
-      </w:r>
-      <w:r>
-        <w:t xml:space="preserve">also writes</w:t>
-      </w:r>
-      <w:r>
-        <w:t xml:space="preserve"> </w:t>
-      </w:r>
-      <w:r>
-        <w:rPr>
-          <w:rStyle w:val="VerbatimChar"/>
-        </w:rPr>
-        <w:t xml:space="preserve">step12_risk_register.csv</w:t>
-      </w:r>
-      <w:r>
-        <w:t xml:space="preserve">;</w:t>
-      </w:r>
-      <w:r>
-        <w:t xml:space="preserve"> </w:t>
-      </w:r>
-      <w:r>
-        <w:rPr>
-          <w:rStyle w:val="VerbatimChar"/>
-        </w:rPr>
-        <w:t xml:space="preserve">paper_figs.py</w:t>
-      </w:r>
-      <w:r>
-        <w:t xml:space="preserve"> </w:t>
-      </w:r>
-      <w:r>
-        <w:t xml:space="preserve">and</w:t>
-      </w:r>
-      <w:r>
-        <w:t xml:space="preserve"> </w:t>
-      </w:r>
-      <w:r>
-        <w:rPr>
-          <w:rStyle w:val="VerbatimChar"/>
-        </w:rPr>
-        <w:t xml:space="preserve">appendix_tables.py</w:t>
-      </w:r>
-      <w:r>
-        <w:t xml:space="preserve"> </w:t>
-      </w:r>
-      <w:r>
-        <w:t xml:space="preserve">write into</w:t>
-      </w:r>
-      <w:r>
-        <w:t xml:space="preserve"> </w:t>
-      </w:r>
-      <w:r>
-        <w:rPr>
-          <w:rStyle w:val="VerbatimChar"/>
-        </w:rPr>
-        <w:t xml:space="preserve">Net3/Figures/paper/</w:t>
-      </w:r>
-      <w:r>
-        <w:t xml:space="preserve">; and</w:t>
-      </w:r>
-      <w:r>
-        <w:t xml:space="preserve"> </w:t>
-      </w:r>
-      <w:r>
-        <w:rPr>
-          <w:rStyle w:val="VerbatimChar"/>
-        </w:rPr>
-        <w:t xml:space="preserve">provenance.py</w:t>
-      </w:r>
-      <w:r>
-        <w:t xml:space="preserve"> </w:t>
-      </w:r>
-      <w:r>
-        <w:t xml:space="preserve">writes</w:t>
-      </w:r>
-      <w:r>
-        <w:t xml:space="preserve"> </w:t>
-      </w:r>
-      <w:r>
-        <w:rPr>
-          <w:rStyle w:val="VerbatimChar"/>
-        </w:rPr>
-        <w:t xml:space="preserve">cache_manifest.json</w:t>
-      </w:r>
-      <w:r>
-        <w:t xml:space="preserve">, which</w:t>
-      </w:r>
-      <w:r>
-        <w:t xml:space="preserve"> </w:t>
-      </w:r>
-      <w:r>
-        <w:rPr>
-          <w:rStyle w:val="VerbatimChar"/>
-        </w:rPr>
-        <w:t xml:space="preserve">validate_artifacts.py</w:t>
-      </w:r>
-      <w:r>
-        <w:t xml:space="preserve"> </w:t>
-      </w:r>
-      <w:r>
-        <w:t xml:space="preserve">reads without writing an artifact of its own.</w:t>
+        <w:t xml:space="preserve">writes, and not by the standard deviation of the run being reported.</w:t>
       </w:r>
     </w:p>
     <w:tbl>

</xml_diff>

<commit_message>
docs(paper): cite the named methods where Methods defines them
Sections 2.2 to 2.8.3 carried no citations at all. Three of the methods
they specify are named, established procedures whose sources refs.bib
already holds, cited in the Introduction but not at the point of use:
the GLUE weighting rule in 2.3.4, the Fisher/Cramer-Rao assessment in
2.4.3 and the profile likelihood in 2.4.4. A reader arriving at the
definition had nothing to follow.

Costs nothing: citation keys are stripped before the word count.

Still uncited, and needing a reference refs.bib does not have: the
scrambled Sobol sampling that the whole 8192-member candidate library
rests on. Left open rather than filled from memory.

Co-Authored-By: Claude Opus 5 (1M context) <noreply@anthropic.com>
</commit_message>
<xml_diff>
--- a/00-thesis/paper.docx
+++ b/00-thesis/paper.docx
@@ -4034,13 +4034,25 @@
         <w:pStyle w:val="FirstParagraph"/>
       </w:pPr>
       <w:r>
-        <w:t xml:space="preserve">The specific informal GLUE weighting used in the original analysis of this system was retained</w:t>
-      </w:r>
-      <w:r>
-        <w:t xml:space="preserve"> </w:t>
-      </w:r>
-      <w:r>
-        <w:t xml:space="preserve">as a comparator, so that its effect could be measured on the same observations and predictions</w:t>
+        <w:t xml:space="preserve">The specific informal GLUE weighting</w:t>
+      </w:r>
+      <w:r>
+        <w:t xml:space="preserve"> </w:t>
+      </w:r>
+      <w:r>
+        <w:t xml:space="preserve">(Beven &amp; Binley, 1992)</w:t>
+      </w:r>
+      <w:r>
+        <w:t xml:space="preserve"> </w:t>
+      </w:r>
+      <w:r>
+        <w:t xml:space="preserve">used in the original analysis of this</w:t>
+      </w:r>
+      <w:r>
+        <w:t xml:space="preserve"> </w:t>
+      </w:r>
+      <w:r>
+        <w:t xml:space="preserve">system was retained as a comparator, so that its effect could be measured on the same observations and predictions</w:t>
       </w:r>
       <w:r>
         <w:t xml:space="preserve"> </w:t>
@@ -5216,7 +5228,16 @@
         <w:pStyle w:val="FirstParagraph"/>
       </w:pPr>
       <w:r>
-        <w:t xml:space="preserve">Local identifiability was assessed from the sensitivity Jacobian of the 294 monitored values.</w:t>
+        <w:t xml:space="preserve">Local identifiability was assessed from the sensitivity Jacobian of the 294 monitored values</w:t>
+      </w:r>
+      <w:r>
+        <w:t xml:space="preserve"> </w:t>
+      </w:r>
+      <w:r>
+        <w:t xml:space="preserve">(Brun, Reichert &amp; Künsch, 2001)</w:t>
+      </w:r>
+      <w:r>
+        <w:t xml:space="preserve">.</w:t>
       </w:r>
       <w:r>
         <w:t xml:space="preserve"> </w:t>
@@ -5500,7 +5521,29 @@
         <w:pStyle w:val="FirstParagraph"/>
       </w:pPr>
       <w:r>
-        <w:t xml:space="preserve">Likelihood geometry was assessed by continuous single-parameter profiles: each wall coefficient</w:t>
+        <w:t xml:space="preserve">Likelihood geometry was assessed by continuous single-parameter profiles</w:t>
+      </w:r>
+      <w:r>
+        <w:t xml:space="preserve"> </w:t>
+      </w:r>
+      <w:r>
+        <w:t xml:space="preserve">(Raue</w:t>
+      </w:r>
+      <w:r>
+        <w:t xml:space="preserve"> </w:t>
+      </w:r>
+      <w:r>
+        <w:rPr>
+          <w:i/>
+          <w:iCs/>
+        </w:rPr>
+        <w:t xml:space="preserve">et al.</w:t>
+      </w:r>
+      <w:r>
+        <w:t xml:space="preserve">, 2009)</w:t>
+      </w:r>
+      <w:r>
+        <w:t xml:space="preserve">: each wall coefficient</w:t>
       </w:r>
       <w:r>
         <w:t xml:space="preserve"> </w:t>

</xml_diff>

<commit_message>
docs(paper): cite Sobol' 1967 and Owen 1998 for the sampler
The scrambled Sobol design behind the whole 8192-member candidate
library had no source. Both entries are transcribed from the publisher
landing pages rather than from memory, and both are recorded as verified
in REFERENCE_CHECK.md on that basis.

scipy.stats.qmc.Sobol, which wq_common.sobol_draws calls, lists five
sources. Sobol' 1967 is the sequence and Owen 1998 is the scrambling,
which is exactly what Section 2.3.1 claims to use. Matousek 1998 and
Joe & Kuo 2008 are implementation detail and are not cited.

Note for anyone searching: the 1967 paper exists in two versions with
different pagination. The Russian original is 7:784-802; the English
translation cited here is 7(4):86-112.

Co-Authored-By: Claude Opus 5 (1M context) <noreply@anthropic.com>
</commit_message>
<xml_diff>
--- a/00-thesis/paper.docx
+++ b/00-thesis/paper.docx
@@ -3186,7 +3186,16 @@
         <w:t xml:space="preserve"> </w:t>
       </w:r>
       <w:r>
-        <w:t xml:space="preserve">scrambled Sobol draws.</w:t>
+        <w:t xml:space="preserve">scrambled Sobol draws</w:t>
+      </w:r>
+      <w:r>
+        <w:t xml:space="preserve"> </w:t>
+      </w:r>
+      <w:r>
+        <w:t xml:space="preserve">(Sobol’, 1967; Owen, 1998)</w:t>
+      </w:r>
+      <w:r>
+        <w:t xml:space="preserve">.</w:t>
       </w:r>
       <w:r>
         <w:t xml:space="preserve"> </w:t>
@@ -18841,7 +18850,7 @@
       </w:r>
     </w:p>
     <w:bookmarkEnd w:id="102"/>
-    <w:bookmarkStart w:id="146" w:name="references"/>
+    <w:bookmarkStart w:id="150" w:name="references"/>
     <w:p>
       <w:pPr>
         <w:pStyle w:val="Heading1"/>
@@ -18850,7 +18859,7 @@
         <w:t xml:space="preserve">References</w:t>
       </w:r>
     </w:p>
-    <w:bookmarkStart w:id="145" w:name="refs"/>
+    <w:bookmarkStart w:id="149" w:name="refs"/>
     <w:bookmarkStart w:id="104" w:name="ref-BevenBinley1992"/>
     <w:p>
       <w:pPr>
@@ -19344,7 +19353,68 @@
       </w:r>
     </w:p>
     <w:bookmarkEnd w:id="126"/>
-    <w:bookmarkStart w:id="128" w:name="ref-PeiroviMinaee2019GAPSO"/>
+    <w:bookmarkStart w:id="128" w:name="ref-Owen1998"/>
+    <w:p>
+      <w:pPr>
+        <w:pStyle w:val="Bibliography"/>
+      </w:pPr>
+      <w:r>
+        <w:t xml:space="preserve">Owen, A.B. (1998) Scrambling</w:t>
+      </w:r>
+      <w:r>
+        <w:t xml:space="preserve"> </w:t>
+      </w:r>
+      <w:r>
+        <w:t xml:space="preserve">Sobol’</w:t>
+      </w:r>
+      <w:r>
+        <w:t xml:space="preserve"> </w:t>
+      </w:r>
+      <w:r>
+        <w:t xml:space="preserve">and</w:t>
+      </w:r>
+      <w:r>
+        <w:t xml:space="preserve"> </w:t>
+      </w:r>
+      <w:r>
+        <w:t xml:space="preserve">Niederreiter–Xing</w:t>
+      </w:r>
+      <w:r>
+        <w:t xml:space="preserve"> </w:t>
+      </w:r>
+      <w:r>
+        <w:t xml:space="preserve">points.</w:t>
+      </w:r>
+      <w:r>
+        <w:t xml:space="preserve"> </w:t>
+      </w:r>
+      <w:r>
+        <w:rPr>
+          <w:i/>
+          <w:iCs/>
+        </w:rPr>
+        <w:t xml:space="preserve">Journal of Complexity</w:t>
+      </w:r>
+      <w:r>
+        <w:t xml:space="preserve">. 14(4), 466–489.</w:t>
+      </w:r>
+      <w:r>
+        <w:t xml:space="preserve"> </w:t>
+      </w:r>
+      <w:hyperlink r:id="rId127">
+        <w:r>
+          <w:rPr>
+            <w:rStyle w:val="Hyperlink"/>
+          </w:rPr>
+          <w:t xml:space="preserve">10.1006/jcom.1998.0487</w:t>
+        </w:r>
+      </w:hyperlink>
+      <w:r>
+        <w:t xml:space="preserve">.</w:t>
+      </w:r>
+    </w:p>
+    <w:bookmarkEnd w:id="128"/>
+    <w:bookmarkStart w:id="130" w:name="ref-PeiroviMinaee2019GAPSO"/>
     <w:p>
       <w:pPr>
         <w:pStyle w:val="Bibliography"/>
@@ -19368,7 +19438,7 @@
       <w:r>
         <w:t xml:space="preserve"> </w:t>
       </w:r>
-      <w:hyperlink r:id="rId127">
+      <w:hyperlink r:id="rId129">
         <w:r>
           <w:rPr>
             <w:rStyle w:val="Hyperlink"/>
@@ -19380,8 +19450,8 @@
         <w:t xml:space="preserve">.</w:t>
       </w:r>
     </w:p>
-    <w:bookmarkEnd w:id="128"/>
-    <w:bookmarkStart w:id="130" w:name="ref-Powell2000"/>
+    <w:bookmarkEnd w:id="130"/>
+    <w:bookmarkStart w:id="132" w:name="ref-Powell2000"/>
     <w:p>
       <w:pPr>
         <w:pStyle w:val="Bibliography"/>
@@ -19405,7 +19475,7 @@
       <w:r>
         <w:t xml:space="preserve"> </w:t>
       </w:r>
-      <w:hyperlink r:id="rId129">
+      <w:hyperlink r:id="rId131">
         <w:r>
           <w:rPr>
             <w:rStyle w:val="Hyperlink"/>
@@ -19417,8 +19487,8 @@
         <w:t xml:space="preserve">.</w:t>
       </w:r>
     </w:p>
-    <w:bookmarkEnd w:id="130"/>
-    <w:bookmarkStart w:id="132" w:name="ref-Rajakumar2019EnKF"/>
+    <w:bookmarkEnd w:id="132"/>
+    <w:bookmarkStart w:id="134" w:name="ref-Rajakumar2019EnKF"/>
     <w:p>
       <w:pPr>
         <w:pStyle w:val="Bibliography"/>
@@ -19454,7 +19524,7 @@
       <w:r>
         <w:t xml:space="preserve"> </w:t>
       </w:r>
-      <w:hyperlink r:id="rId131">
+      <w:hyperlink r:id="rId133">
         <w:r>
           <w:rPr>
             <w:rStyle w:val="Hyperlink"/>
@@ -19466,8 +19536,8 @@
         <w:t xml:space="preserve">.</w:t>
       </w:r>
     </w:p>
-    <w:bookmarkEnd w:id="132"/>
-    <w:bookmarkStart w:id="134" w:name="ref-Raue2009"/>
+    <w:bookmarkEnd w:id="134"/>
+    <w:bookmarkStart w:id="136" w:name="ref-Raue2009"/>
     <w:p>
       <w:pPr>
         <w:pStyle w:val="Bibliography"/>
@@ -19491,7 +19561,7 @@
       <w:r>
         <w:t xml:space="preserve"> </w:t>
       </w:r>
-      <w:hyperlink r:id="rId133">
+      <w:hyperlink r:id="rId135">
         <w:r>
           <w:rPr>
             <w:rStyle w:val="Hyperlink"/>
@@ -19503,8 +19573,8 @@
         <w:t xml:space="preserve">.</w:t>
       </w:r>
     </w:p>
-    <w:bookmarkEnd w:id="134"/>
-    <w:bookmarkStart w:id="135" w:name="ref-Rossman2000"/>
+    <w:bookmarkEnd w:id="136"/>
+    <w:bookmarkStart w:id="137" w:name="ref-Rossman2000"/>
     <w:p>
       <w:pPr>
         <w:pStyle w:val="Bibliography"/>
@@ -19540,8 +19610,8 @@
         <w:t xml:space="preserve">. Cincinnati, OH: U.S. Environmental Protection Agency.</w:t>
       </w:r>
     </w:p>
-    <w:bookmarkEnd w:id="135"/>
-    <w:bookmarkStart w:id="137" w:name="ref-Rossman1994"/>
+    <w:bookmarkEnd w:id="137"/>
+    <w:bookmarkStart w:id="139" w:name="ref-Rossman1994"/>
     <w:p>
       <w:pPr>
         <w:pStyle w:val="Bibliography"/>
@@ -19565,7 +19635,7 @@
       <w:r>
         <w:t xml:space="preserve"> </w:t>
       </w:r>
-      <w:hyperlink r:id="rId136">
+      <w:hyperlink r:id="rId138">
         <w:r>
           <w:rPr>
             <w:rStyle w:val="Hyperlink"/>
@@ -19577,8 +19647,8 @@
         <w:t xml:space="preserve">.</w:t>
       </w:r>
     </w:p>
-    <w:bookmarkEnd w:id="137"/>
-    <w:bookmarkStart w:id="138" w:name="ref-Rossman2020"/>
+    <w:bookmarkEnd w:id="139"/>
+    <w:bookmarkStart w:id="140" w:name="ref-Rossman2020"/>
     <w:p>
       <w:pPr>
         <w:pStyle w:val="Bibliography"/>
@@ -19614,8 +19684,45 @@
         <w:t xml:space="preserve">. Cincinnati, OH: U.S. Environmental Protection Agency.</w:t>
       </w:r>
     </w:p>
-    <w:bookmarkEnd w:id="138"/>
-    <w:bookmarkStart w:id="140" w:name="ref-Stedinger2008"/>
+    <w:bookmarkEnd w:id="140"/>
+    <w:bookmarkStart w:id="142" w:name="ref-Sobol1967"/>
+    <w:p>
+      <w:pPr>
+        <w:pStyle w:val="Bibliography"/>
+      </w:pPr>
+      <w:r>
+        <w:t xml:space="preserve">Sobol’, I.M. (1967) On the distribution of points in a cube and the approximate evaluation of integrals.</w:t>
+      </w:r>
+      <w:r>
+        <w:t xml:space="preserve"> </w:t>
+      </w:r>
+      <w:r>
+        <w:rPr>
+          <w:i/>
+          <w:iCs/>
+        </w:rPr>
+        <w:t xml:space="preserve">USSR Computational Mathematics and Mathematical Physics</w:t>
+      </w:r>
+      <w:r>
+        <w:t xml:space="preserve">. 7(4), 86–112.</w:t>
+      </w:r>
+      <w:r>
+        <w:t xml:space="preserve"> </w:t>
+      </w:r>
+      <w:hyperlink r:id="rId141">
+        <w:r>
+          <w:rPr>
+            <w:rStyle w:val="Hyperlink"/>
+          </w:rPr>
+          <w:t xml:space="preserve">10.1016/0041-5553(67)90144-9</w:t>
+        </w:r>
+      </w:hyperlink>
+      <w:r>
+        <w:t xml:space="preserve">.</w:t>
+      </w:r>
+    </w:p>
+    <w:bookmarkEnd w:id="142"/>
+    <w:bookmarkStart w:id="144" w:name="ref-Stedinger2008"/>
     <w:p>
       <w:pPr>
         <w:pStyle w:val="Bibliography"/>
@@ -19645,7 +19752,7 @@
       <w:r>
         <w:t xml:space="preserve"> </w:t>
       </w:r>
-      <w:hyperlink r:id="rId139">
+      <w:hyperlink r:id="rId143">
         <w:r>
           <w:rPr>
             <w:rStyle w:val="Hyperlink"/>
@@ -19657,8 +19764,8 @@
         <w:t xml:space="preserve">.</w:t>
       </w:r>
     </w:p>
-    <w:bookmarkEnd w:id="140"/>
-    <w:bookmarkStart w:id="142" w:name="ref-Vasconcelos1997"/>
+    <w:bookmarkEnd w:id="144"/>
+    <w:bookmarkStart w:id="146" w:name="ref-Vasconcelos1997"/>
     <w:p>
       <w:pPr>
         <w:pStyle w:val="Bibliography"/>
@@ -19682,7 +19789,7 @@
       <w:r>
         <w:t xml:space="preserve"> </w:t>
       </w:r>
-      <w:hyperlink r:id="rId141">
+      <w:hyperlink r:id="rId145">
         <w:r>
           <w:rPr>
             <w:rStyle w:val="Hyperlink"/>
@@ -19694,8 +19801,8 @@
         <w:t xml:space="preserve">.</w:t>
       </w:r>
     </w:p>
-    <w:bookmarkEnd w:id="142"/>
-    <w:bookmarkStart w:id="144" w:name="ref-Wu2022BEAR"/>
+    <w:bookmarkEnd w:id="146"/>
+    <w:bookmarkStart w:id="148" w:name="ref-Wu2022BEAR"/>
     <w:p>
       <w:pPr>
         <w:pStyle w:val="Bibliography"/>
@@ -19719,7 +19826,7 @@
       <w:r>
         <w:t xml:space="preserve"> </w:t>
       </w:r>
-      <w:hyperlink r:id="rId143">
+      <w:hyperlink r:id="rId147">
         <w:r>
           <w:rPr>
             <w:rStyle w:val="Hyperlink"/>
@@ -19731,10 +19838,10 @@
         <w:t xml:space="preserve">.</w:t>
       </w:r>
     </w:p>
-    <w:bookmarkEnd w:id="144"/>
-    <w:bookmarkEnd w:id="145"/>
-    <w:bookmarkEnd w:id="146"/>
-    <w:bookmarkStart w:id="156" w:name="appendices"/>
+    <w:bookmarkEnd w:id="148"/>
+    <w:bookmarkEnd w:id="149"/>
+    <w:bookmarkEnd w:id="150"/>
+    <w:bookmarkStart w:id="160" w:name="appendices"/>
     <w:p>
       <w:pPr>
         <w:pStyle w:val="Heading1"/>
@@ -19769,7 +19876,7 @@
         <w:t xml:space="preserve">Appendix I maps each section of the paper to the script that produced its numbers.</w:t>
       </w:r>
     </w:p>
-    <w:bookmarkStart w:id="147" w:name="Xb23e304d159119e7df644cc02d3033fc484721a"/>
+    <w:bookmarkStart w:id="151" w:name="Xb23e304d159119e7df644cc02d3033fc484721a"/>
     <w:p>
       <w:pPr>
         <w:pStyle w:val="Heading2"/>
@@ -20841,8 +20948,8 @@
         </w:tc>
       </w:tr>
     </w:tbl>
-    <w:bookmarkEnd w:id="147"/>
-    <w:bookmarkStart w:id="148" w:name="Xe02d61a32b764c6b297a8c29969b13a7581353f"/>
+    <w:bookmarkEnd w:id="151"/>
+    <w:bookmarkStart w:id="152" w:name="Xe02d61a32b764c6b297a8c29969b13a7581353f"/>
     <w:p>
       <w:pPr>
         <w:pStyle w:val="Heading2"/>
@@ -21823,8 +21930,8 @@
         <w:t xml:space="preserve">in Tables B1 and B2 pass either way.</w:t>
       </w:r>
     </w:p>
-    <w:bookmarkEnd w:id="148"/>
-    <w:bookmarkStart w:id="149" w:name="X27ef15b8fad7bb29a56bb09609875822f773d4e"/>
+    <w:bookmarkEnd w:id="152"/>
+    <w:bookmarkStart w:id="153" w:name="X27ef15b8fad7bb29a56bb09609875822f773d4e"/>
     <w:p>
       <w:pPr>
         <w:pStyle w:val="Heading2"/>
@@ -23286,8 +23393,8 @@
         </w:tc>
       </w:tr>
     </w:tbl>
-    <w:bookmarkEnd w:id="149"/>
-    <w:bookmarkStart w:id="150" w:name="appendix-d.-fisher-information-mechanics"/>
+    <w:bookmarkEnd w:id="153"/>
+    <w:bookmarkStart w:id="154" w:name="appendix-d.-fisher-information-mechanics"/>
     <w:p>
       <w:pPr>
         <w:pStyle w:val="Heading2"/>
@@ -25071,8 +25178,8 @@
         </w:tc>
       </w:tr>
     </w:tbl>
-    <w:bookmarkEnd w:id="150"/>
-    <w:bookmarkStart w:id="151" w:name="X1a3ae0efdf8b2c76c22382abba68415e1d80e1c"/>
+    <w:bookmarkEnd w:id="154"/>
+    <w:bookmarkStart w:id="155" w:name="X1a3ae0efdf8b2c76c22382abba68415e1d80e1c"/>
     <w:p>
       <w:pPr>
         <w:pStyle w:val="Heading2"/>
@@ -27419,8 +27526,8 @@
         </w:tc>
       </w:tr>
     </w:tbl>
-    <w:bookmarkEnd w:id="151"/>
-    <w:bookmarkStart w:id="152" w:name="Xc8c108fff9324274ec271495265452b9f890e51"/>
+    <w:bookmarkEnd w:id="155"/>
+    <w:bookmarkStart w:id="156" w:name="Xc8c108fff9324274ec271495265452b9f890e51"/>
     <w:p>
       <w:pPr>
         <w:pStyle w:val="Heading2"/>
@@ -30999,8 +31106,8 @@
         </w:tc>
       </w:tr>
     </w:tbl>
-    <w:bookmarkEnd w:id="152"/>
-    <w:bookmarkStart w:id="153" w:name="appendix-g.-risk-assessment-mechanics"/>
+    <w:bookmarkEnd w:id="156"/>
+    <w:bookmarkStart w:id="157" w:name="appendix-g.-risk-assessment-mechanics"/>
     <w:p>
       <w:pPr>
         <w:pStyle w:val="Heading2"/>
@@ -31743,8 +31850,8 @@
         </w:tc>
       </w:tr>
     </w:tbl>
-    <w:bookmarkEnd w:id="153"/>
-    <w:bookmarkStart w:id="154" w:name="Xc0b2899ea87b71e9f8a5d7e226fe2b64e1dc44b"/>
+    <w:bookmarkEnd w:id="157"/>
+    <w:bookmarkStart w:id="158" w:name="Xc0b2899ea87b71e9f8a5d7e226fe2b64e1dc44b"/>
     <w:p>
       <w:pPr>
         <w:pStyle w:val="Heading2"/>
@@ -39827,8 +39934,8 @@
         </w:tc>
       </w:tr>
     </w:tbl>
-    <w:bookmarkEnd w:id="154"/>
-    <w:bookmarkStart w:id="155" w:name="X514ef38f2df5d3fe48656593e9361161d514c31"/>
+    <w:bookmarkEnd w:id="158"/>
+    <w:bookmarkStart w:id="159" w:name="X514ef38f2df5d3fe48656593e9361161d514c31"/>
     <w:p>
       <w:pPr>
         <w:pStyle w:val="Heading2"/>
@@ -40742,8 +40849,8 @@
         </w:tc>
       </w:tr>
     </w:tbl>
-    <w:bookmarkEnd w:id="155"/>
-    <w:bookmarkEnd w:id="156"/>
+    <w:bookmarkEnd w:id="159"/>
+    <w:bookmarkEnd w:id="160"/>
     <w:sectPr>
       <w:pgSz w:h="16838" w:w="11906"/>
       <w:pgMar w:bottom="1417" w:footer="708" w:gutter="0" w:header="708" w:left="1417" w:right="1417" w:top="1417"/>

</xml_diff>

<commit_message>
docs(paper): back under the limit
Co-Authored-By: Claude Opus 5 (1M context) <noreply@anthropic.com>
</commit_message>
<xml_diff>
--- a/00-thesis/paper.docx
+++ b/00-thesis/paper.docx
@@ -11879,13 +11879,13 @@
         <w:t xml:space="preserve"> </w:t>
       </w:r>
       <w:r>
-        <w:t xml:space="preserve">set the level on its own. The two average-zone monitors differ by nearly a factor of two, and</w:t>
-      </w:r>
-      <w:r>
-        <w:t xml:space="preserve"> </w:t>
-      </w:r>
-      <w:r>
-        <w:t xml:space="preserve">node 231 sits only 0.019 mg L</w:t>
+        <w:t xml:space="preserve">set the level on its own. The two average-zone monitors differ by nearly a factor of two, and node 231 clears the highest</w:t>
+      </w:r>
+      <w:r>
+        <w:t xml:space="preserve"> </w:t>
+      </w:r>
+      <w:r>
+        <w:t xml:space="preserve">old-zone monitor by only 0.019 mg L</w:t>
       </w:r>
       <w:r>
         <w:rPr>
@@ -11894,16 +11894,13 @@
         <w:t xml:space="preserve">-1</w:t>
       </w:r>
       <w:r>
-        <w:t xml:space="preserve"> </w:t>
-      </w:r>
-      <w:r>
-        <w:t xml:space="preserve">above the highest old-zone monitor, because hydraulic residence</w:t>
-      </w:r>
-      <w:r>
-        <w:t xml:space="preserve"> </w:t>
-      </w:r>
-      <w:r>
-        <w:t xml:space="preserve">and network position also modulate the accumulated decay. In the deterministic noise-free reference trajectory, 21 of the 92 junctions cross below the</w:t>
+        <w:t xml:space="preserve">, because residence time and network position also</w:t>
+      </w:r>
+      <w:r>
+        <w:t xml:space="preserve"> </w:t>
+      </w:r>
+      <w:r>
+        <w:t xml:space="preserve">modulate the accumulated decay. In the deterministic noise-free reference trajectory, 21 of the 92 junctions cross below the</w:t>
       </w:r>
       <w:r>
         <w:t xml:space="preserve"> </w:t>

</xml_diff>

<commit_message>
docs(paper): back under the 12,000 limit
Co-Authored-By: Claude Opus 5 (1M context) <noreply@anthropic.com>
</commit_message>
<xml_diff>
--- a/00-thesis/paper.docx
+++ b/00-thesis/paper.docx
@@ -3112,19 +3112,13 @@
         </m:r>
       </m:oMath>
       <w:r>
-        <w:t xml:space="preserve">. Wall-reaction behaviour</w:t>
-      </w:r>
-      <w:r>
-        <w:t xml:space="preserve"> </w:t>
-      </w:r>
-      <w:r>
-        <w:t xml:space="preserve">was checked for the expected sign, for monotonic response, and against the limiting case without</w:t>
-      </w:r>
-      <w:r>
-        <w:t xml:space="preserve"> </w:t>
-      </w:r>
-      <w:r>
-        <w:t xml:space="preserve">mass-transfer resistance. A unit-equivalence test confirmed that the</w:t>
+        <w:t xml:space="preserve">. Wall-reaction behaviour was checked for the expected sign, for monotonic response, and against</w:t>
+      </w:r>
+      <w:r>
+        <w:t xml:space="preserve"> </w:t>
+      </w:r>
+      <w:r>
+        <w:t xml:space="preserve">the limiting case without mass transfer. A unit-equivalence test confirmed that the</w:t>
       </w:r>
       <w:r>
         <w:t xml:space="preserve"> </w:t>
@@ -11873,19 +11867,13 @@
         <w:t xml:space="preserve"> </w:t>
       </w:r>
       <w:r>
-        <w:t xml:space="preserve">old zone. The broad zonal pattern follows the imposed reactivity contrast, but the coefficient does not</w:t>
-      </w:r>
-      <w:r>
-        <w:t xml:space="preserve"> </w:t>
-      </w:r>
-      <w:r>
-        <w:t xml:space="preserve">set the level on its own. The two average-zone monitors differ by nearly a factor of two, and node 231 clears the highest</w:t>
-      </w:r>
-      <w:r>
-        <w:t xml:space="preserve"> </w:t>
-      </w:r>
-      <w:r>
-        <w:t xml:space="preserve">old-zone monitor by only 0.019 mg L</w:t>
+        <w:t xml:space="preserve">old zone. The zonal pattern follows the imposed reactivity contrast, but the coefficient does not set the</w:t>
+      </w:r>
+      <w:r>
+        <w:t xml:space="preserve"> </w:t>
+      </w:r>
+      <w:r>
+        <w:t xml:space="preserve">level on its own. The two average-zone monitors differ by nearly a factor of two, and node 231 clears the highest old-zone monitor by only 0.019 mg L</w:t>
       </w:r>
       <w:r>
         <w:rPr>
@@ -11894,19 +11882,13 @@
         <w:t xml:space="preserve">-1</w:t>
       </w:r>
       <w:r>
-        <w:t xml:space="preserve">, because residence time and network position also</w:t>
-      </w:r>
-      <w:r>
-        <w:t xml:space="preserve"> </w:t>
-      </w:r>
-      <w:r>
-        <w:t xml:space="preserve">modulate the accumulated decay. In the deterministic noise-free reference trajectory, 21 of the 92 junctions cross below the</w:t>
-      </w:r>
-      <w:r>
-        <w:t xml:space="preserve"> </w:t>
-      </w:r>
-      <w:r>
-        <w:t xml:space="preserve">0.2 mg L</w:t>
+        <w:t xml:space="preserve">, because residence time</w:t>
+      </w:r>
+      <w:r>
+        <w:t xml:space="preserve"> </w:t>
+      </w:r>
+      <w:r>
+        <w:t xml:space="preserve">and position also modulate the accumulated decay. In the noise-free reference trajectory, 21 of the 92 junctions cross below the 0.2 mg L</w:t>
       </w:r>
       <w:r>
         <w:rPr>

</xml_diff>

<commit_message>
docs(paper): drop the promise of a published commit history
The statement answered two optional items in the Library guidance, the
date each output was generated and how it was revised, by pointing at
the repository history: "recorded commit by commit ... 89 commits carry
a Claude Opus 5 co-author trailer".

The repository being published is a squashed release snapshot with no
development history. That sentence would have sent a reader to a record
that is not there, which is worse than not answering an optional item at
all. Both items are "may include", so the sentence is removed rather
than reworded.

Nothing else in the paper or in the release README refers to commit
history. The Appendix I citation is a tag and a commit hash, which a
squashed repository still has.

The five required elements and the four-category breakdown are
unchanged. 12,000 counted.

Co-Authored-By: Claude Opus 5 (1M context) <noreply@anthropic.com>
</commit_message>
<xml_diff>
--- a/00-thesis/paper.docx
+++ b/00-thesis/paper.docx
@@ -20155,25 +20155,7 @@
         <w:t xml:space="preserve"> </w:t>
       </w:r>
       <w:r>
-        <w:t xml:space="preserve">file below. The paragraphs give the expanded description. Use ran from 17 May to 12 August 2026 and is</w:t>
-      </w:r>
-      <w:r>
-        <w:t xml:space="preserve"> </w:t>
-      </w:r>
-      <w:r>
-        <w:t xml:space="preserve">recorded commit by commit in the repository history, where 89 commits carry a Claude Opus 5</w:t>
-      </w:r>
-      <w:r>
-        <w:t xml:space="preserve"> </w:t>
-      </w:r>
-      <w:r>
-        <w:t xml:space="preserve">co-author trailer; that history is the record of what was generated when, and of how each output</w:t>
-      </w:r>
-      <w:r>
-        <w:t xml:space="preserve"> </w:t>
-      </w:r>
-      <w:r>
-        <w:t xml:space="preserve">was revised before it entered the paper.</w:t>
+        <w:t xml:space="preserve">file below. The paragraphs that follow give the expanded description.</w:t>
       </w:r>
     </w:p>
     <w:p>

</xml_diff>

<commit_message>
docs(paper): fold the four corrections into the checking they came from
The statement had a separate "Where AI changed a conclusion" paragraph
naming four specific corrections: a posterior width in Figure 6, an
evidence basis in Table 3, a summary-detail contradiction in
RESULTS_LOG.md, and a quantity mismatch between Figure 5C and Section
2.6.3.

That level of detail is required by neither policy, and enumerating four
errors that no longer exist in the submitted paper invites the question
of what a fifth might be. The corrections were to how results were
described, not to any result; the numbers never changed.

The point they made, that the checking was not decorative, is kept as
one sentence in the paragraph about that checking. Five categories
become four.

Co-Authored-By: Claude Opus 5 (1M context) <noreply@anthropic.com>
</commit_message>
<xml_diff>
--- a/00-thesis/paper.docx
+++ b/00-thesis/paper.docx
@@ -20245,7 +20245,13 @@
         <w:t xml:space="preserve"> </w:t>
       </w:r>
       <w:r>
-        <w:t xml:space="preserve">manuscript against the stored artifacts, one registered comparison per quoted figure, run by</w:t>
+        <w:t xml:space="preserve">manuscript and its figures against the stored artifacts, one registered comparison per quoted</w:t>
+      </w:r>
+      <w:r>
+        <w:t xml:space="preserve"> </w:t>
+      </w:r>
+      <w:r>
+        <w:t xml:space="preserve">figure, run by</w:t>
       </w:r>
       <w:r>
         <w:t xml:space="preserve"> </w:t>
@@ -20257,67 +20263,13 @@
         <w:t xml:space="preserve">Net3/validate_artifacts.py</w:t>
       </w:r>
       <w:r>
-        <w:t xml:space="preserve">.</w:t>
-      </w:r>
-    </w:p>
-    <w:p>
-      <w:pPr>
-        <w:pStyle w:val="BodyText"/>
-      </w:pPr>
-      <w:r>
-        <w:rPr>
-          <w:b/>
-          <w:bCs/>
-        </w:rPr>
-        <w:t xml:space="preserve">Where AI changed a conclusion.</w:t>
-      </w:r>
-      <w:r>
-        <w:t xml:space="preserve"> </w:t>
-      </w:r>
-      <w:r>
-        <w:t xml:space="preserve">Three cases in which a single noise realisation had been</w:t>
-      </w:r>
-      <w:r>
-        <w:t xml:space="preserve"> </w:t>
-      </w:r>
-      <w:r>
-        <w:t xml:space="preserve">presented as a repeated result were identified by AI review: an incorrect posterior width in</w:t>
-      </w:r>
-      <w:r>
-        <w:t xml:space="preserve"> </w:t>
-      </w:r>
-      <w:r>
-        <w:t xml:space="preserve">Figure 6, an incorrect evidence basis in Table 3, and a contradiction between the summary and</w:t>
-      </w:r>
-      <w:r>
-        <w:t xml:space="preserve"> </w:t>
-      </w:r>
-      <w:r>
-        <w:t xml:space="preserve">detail sections of</w:t>
-      </w:r>
-      <w:r>
-        <w:t xml:space="preserve"> </w:t>
-      </w:r>
-      <w:r>
-        <w:rPr>
-          <w:rStyle w:val="VerbatimChar"/>
-        </w:rPr>
-        <w:t xml:space="preserve">RESULTS_LOG.md</w:t>
-      </w:r>
-      <w:r>
-        <w:t xml:space="preserve">. A fourth was a mismatch between the quantity plotted in</w:t>
-      </w:r>
-      <w:r>
-        <w:t xml:space="preserve"> </w:t>
-      </w:r>
-      <w:r>
-        <w:t xml:space="preserve">Figure 5C and the quantity defined in Section 2.6.3 and reported in Table 4. All four were</w:t>
-      </w:r>
-      <w:r>
-        <w:t xml:space="preserve"> </w:t>
-      </w:r>
-      <w:r>
-        <w:t xml:space="preserve">corrected.</w:t>
+        <w:t xml:space="preserve">. That checking found places where a result was</w:t>
+      </w:r>
+      <w:r>
+        <w:t xml:space="preserve"> </w:t>
+      </w:r>
+      <w:r>
+        <w:t xml:space="preserve">described inaccurately, and they were corrected before submission.</w:t>
       </w:r>
     </w:p>
     <w:p>

</xml_diff>